<commit_message>
docs: B3 complete - update CLAUDE.md, Changelog, OperationsRunbook v1.3
</commit_message>
<xml_diff>
--- a/docs/NutriLog_Changelog_v1.0.docx
+++ b/docs/NutriLog_Changelog_v1.0.docx
@@ -8,6 +8,7 @@
       </w:pPr>
       <w:r>
         <w:rPr>
+          <w:rFonts w:ascii="Arial" w:cs="Arial" w:eastAsia="Arial" w:hAnsi="Arial"/>
           <w:b/>
           <w:bCs/>
           <w:color w:val="4E5C40"/>
@@ -19,21 +20,22 @@
     </w:p>
     <w:p>
       <w:pPr>
+        <w:spacing w:after="100"/>
+      </w:pPr>
+      <w:r>
+        <w:rPr>
+          <w:rFonts w:ascii="Arial" w:cs="Arial" w:eastAsia="Arial" w:hAnsi="Arial"/>
+          <w:sz w:val="20"/>
+          <w:szCs w:val="20"/>
+        </w:rPr>
+        <w:t xml:space="preserve">Version: v1.0   |   Status: ACTIVE   |   Last Updated: 2026-03-23</w:t>
+      </w:r>
+    </w:p>
+    <w:p>
+      <w:pPr>
         <w:spacing w:after="120"/>
       </w:pPr>
       <w:r>
-        <w:rPr>
-          <w:sz w:val="20"/>
-          <w:szCs w:val="20"/>
-        </w:rPr>
-        <w:t xml:space="preserve">Version: v1.0   |   Status: ACTIVE   |   Last Updated: 2026-03-23</w:t>
-      </w:r>
-    </w:p>
-    <w:p>
-      <w:pPr>
-        <w:spacing w:after="80"/>
-      </w:pPr>
-      <w:r>
         <w:t xml:space="preserve"/>
       </w:r>
     </w:p>
@@ -43,21 +45,23 @@
       </w:pPr>
       <w:r>
         <w:rPr>
+          <w:rFonts w:ascii="Arial" w:cs="Arial" w:eastAsia="Arial" w:hAnsi="Arial"/>
           <w:b/>
           <w:bCs/>
           <w:color w:val="697A58"/>
           <w:sz w:val="24"/>
           <w:szCs w:val="24"/>
         </w:rPr>
-        <w:t xml:space="preserve">B2 · Food Search  —  2026-03-23</w:t>
-      </w:r>
-    </w:p>
-    <w:p>
-      <w:pPr>
-        <w:spacing w:after="120"/>
-      </w:pPr>
-      <w:r>
-        <w:rPr>
+        <w:t xml:space="preserve">B3 · Settings Editor  —  2026-03-23</w:t>
+      </w:r>
+    </w:p>
+    <w:p>
+      <w:pPr>
+        <w:spacing w:after="100"/>
+      </w:pPr>
+      <w:r>
+        <w:rPr>
+          <w:rFonts w:ascii="Arial" w:cs="Arial" w:eastAsia="Arial" w:hAnsi="Arial"/>
           <w:b/>
           <w:bCs/>
           <w:sz w:val="20"/>
@@ -68,7 +72,7 @@
     </w:p>
     <w:p>
       <w:pPr>
-        <w:spacing w:after="80"/>
+        <w:spacing w:after="120"/>
       </w:pPr>
       <w:r>
         <w:t xml:space="preserve"/>
@@ -76,10 +80,11 @@
     </w:p>
     <w:p>
       <w:pPr>
-        <w:spacing w:after="120"/>
-      </w:pPr>
-      <w:r>
-        <w:rPr>
+        <w:spacing w:after="100"/>
+      </w:pPr>
+      <w:r>
+        <w:rPr>
+          <w:rFonts w:ascii="Arial" w:cs="Arial" w:eastAsia="Arial" w:hAnsi="Arial"/>
           <w:b/>
           <w:bCs/>
           <w:sz w:val="20"/>
@@ -90,78 +95,91 @@
     </w:p>
     <w:p>
       <w:pPr>
+        <w:pStyle w:val="ListParagraph"/>
+        <w:numPr>
+          <w:ilvl w:val="0"/>
+          <w:numId w:val="2"/>
+        </w:numPr>
+        <w:spacing w:after="80"/>
+      </w:pPr>
+      <w:r>
+        <w:rPr>
+          <w:rFonts w:ascii="Arial" w:cs="Arial" w:eastAsia="Arial" w:hAnsi="Arial"/>
+          <w:sz w:val="20"/>
+          <w:szCs w:val="20"/>
+        </w:rPr>
+        <w:t xml:space="preserve">Settings page: 5 editable nutrition target fields (Calories / Protein / Carbs / Fat / Fibre)</w:t>
+      </w:r>
+    </w:p>
+    <w:p>
+      <w:pPr>
+        <w:pStyle w:val="ListParagraph"/>
+        <w:numPr>
+          <w:ilvl w:val="0"/>
+          <w:numId w:val="2"/>
+        </w:numPr>
+        <w:spacing w:after="80"/>
+      </w:pPr>
+      <w:r>
+        <w:rPr>
+          <w:rFonts w:ascii="Arial" w:cs="Arial" w:eastAsia="Arial" w:hAnsi="Arial"/>
+          <w:sz w:val="20"/>
+          <w:szCs w:val="20"/>
+        </w:rPr>
+        <w:t xml:space="preserve">Save button writes to Google Sheets Settings tab via updateSettings endpoint</w:t>
+      </w:r>
+    </w:p>
+    <w:p>
+      <w:pPr>
+        <w:pStyle w:val="ListParagraph"/>
+        <w:numPr>
+          <w:ilvl w:val="0"/>
+          <w:numId w:val="2"/>
+        </w:numPr>
+        <w:spacing w:after="80"/>
+      </w:pPr>
+      <w:r>
+        <w:rPr>
+          <w:rFonts w:ascii="Arial" w:cs="Arial" w:eastAsia="Arial" w:hAnsi="Arial"/>
+          <w:sz w:val="20"/>
+          <w:szCs w:val="20"/>
+        </w:rPr>
+        <w:t xml:space="preserve">Values persist across sessions — reloading reads from Sheets</w:t>
+      </w:r>
+    </w:p>
+    <w:p>
+      <w:pPr>
+        <w:pStyle w:val="ListParagraph"/>
+        <w:numPr>
+          <w:ilvl w:val="0"/>
+          <w:numId w:val="2"/>
+        </w:numPr>
+        <w:spacing w:after="80"/>
+      </w:pPr>
+      <w:r>
+        <w:rPr>
+          <w:rFonts w:ascii="Arial" w:cs="Arial" w:eastAsia="Arial" w:hAnsi="Arial"/>
+          <w:sz w:val="20"/>
+          <w:szCs w:val="20"/>
+        </w:rPr>
+        <w:t xml:space="preserve">Input validation with error highlight on out-of-range values</w:t>
+      </w:r>
+    </w:p>
+    <w:p>
+      <w:pPr>
         <w:spacing w:after="120"/>
       </w:pPr>
       <w:r>
-        <w:rPr>
-          <w:sz w:val="20"/>
-          <w:szCs w:val="20"/>
-        </w:rPr>
-        <w:t xml:space="preserve">• Search tab now loads full NutritionDB + CustomFoods on first visit (session cache)</w:t>
-      </w:r>
-    </w:p>
-    <w:p>
-      <w:pPr>
-        <w:spacing w:after="120"/>
-      </w:pPr>
-      <w:r>
-        <w:rPr>
-          <w:sz w:val="20"/>
-          <w:szCs w:val="20"/>
-        </w:rPr>
-        <w:t xml:space="preserve">• Substring search with 200ms debounce, olive-green keyword highlight</w:t>
-      </w:r>
-    </w:p>
-    <w:p>
-      <w:pPr>
-        <w:spacing w:after="120"/>
-      </w:pPr>
-      <w:r>
-        <w:rPr>
-          <w:sz w:val="20"/>
-          <w:szCs w:val="20"/>
-        </w:rPr>
-        <w:t xml:space="preserve">• Favourites: toggle ★ persists to Sheets Favourites sheet; favourites sort first in results</w:t>
-      </w:r>
-    </w:p>
-    <w:p>
-      <w:pPr>
-        <w:spacing w:after="120"/>
-      </w:pPr>
-      <w:r>
-        <w:rPr>
-          <w:sz w:val="20"/>
-          <w:szCs w:val="20"/>
-        </w:rPr>
-        <w:t xml:space="preserve">• Empty search query shows favourites only</w:t>
-      </w:r>
-    </w:p>
-    <w:p>
-      <w:pPr>
-        <w:spacing w:after="120"/>
-      </w:pPr>
-      <w:r>
-        <w:rPr>
-          <w:sz w:val="20"/>
-          <w:szCs w:val="20"/>
-        </w:rPr>
-        <w:t xml:space="preserve">• Bottom sheet: tap any food row to open amount + meal-type selector</w:t>
-      </w:r>
-    </w:p>
-    <w:p>
-      <w:pPr>
-        <w:spacing w:after="80"/>
-      </w:pPr>
-      <w:r>
         <w:t xml:space="preserve"/>
       </w:r>
     </w:p>
     <w:p>
       <w:pPr>
-        <w:spacing w:after="120"/>
-      </w:pPr>
-      <w:r>
-        <w:rPr>
+        <w:spacing w:after="100"/>
+      </w:pPr>
+      <w:r>
+        <w:rPr>
+          <w:rFonts w:ascii="Arial" w:cs="Arial" w:eastAsia="Arial" w:hAnsi="Arial"/>
           <w:b/>
           <w:bCs/>
           <w:sz w:val="20"/>
@@ -190,7 +208,6 @@
       <w:tr>
         <w:tc>
           <w:tcPr>
-            <w:tcW w:type="auto" w:w="0"/>
             <w:tcBorders>
               <w:top w:val="single" w:color="CCCCCC" w:sz="1"/>
               <w:left w:val="single" w:color="CCCCCC" w:sz="1"/>
@@ -208,6 +225,7 @@
           <w:p>
             <w:r>
               <w:rPr>
+                <w:rFonts w:ascii="Arial" w:cs="Arial" w:eastAsia="Arial" w:hAnsi="Arial"/>
                 <w:b/>
                 <w:bCs/>
                 <w:sz w:val="20"/>
@@ -219,7 +237,6 @@
         </w:tc>
         <w:tc>
           <w:tcPr>
-            <w:tcW w:type="auto" w:w="0"/>
             <w:tcBorders>
               <w:top w:val="single" w:color="CCCCCC" w:sz="1"/>
               <w:left w:val="single" w:color="CCCCCC" w:sz="1"/>
@@ -237,6 +254,7 @@
           <w:p>
             <w:r>
               <w:rPr>
+                <w:rFonts w:ascii="Arial" w:cs="Arial" w:eastAsia="Arial" w:hAnsi="Arial"/>
                 <w:b/>
                 <w:bCs/>
                 <w:sz w:val="20"/>
@@ -248,7 +266,6 @@
         </w:tc>
         <w:tc>
           <w:tcPr>
-            <w:tcW w:type="auto" w:w="0"/>
             <w:tcBorders>
               <w:top w:val="single" w:color="CCCCCC" w:sz="1"/>
               <w:left w:val="single" w:color="CCCCCC" w:sz="1"/>
@@ -266,6 +283,7 @@
           <w:p>
             <w:r>
               <w:rPr>
+                <w:rFonts w:ascii="Arial" w:cs="Arial" w:eastAsia="Arial" w:hAnsi="Arial"/>
                 <w:b/>
                 <w:bCs/>
                 <w:sz w:val="20"/>
@@ -296,10 +314,11 @@
           <w:p>
             <w:r>
               <w:rPr>
-                <w:sz w:val="20"/>
-                <w:szCs w:val="20"/>
-              </w:rPr>
-              <w:t xml:space="preserve">gas/Code.gs</w:t>
+                <w:rFonts w:ascii="Arial" w:cs="Arial" w:eastAsia="Arial" w:hAnsi="Arial"/>
+                <w:sz w:val="20"/>
+                <w:szCs w:val="20"/>
+              </w:rPr>
+              <w:t xml:space="preserve">src/settings.js</w:t>
             </w:r>
           </w:p>
         </w:tc>
@@ -322,10 +341,11 @@
           <w:p>
             <w:r>
               <w:rPr>
-                <w:sz w:val="20"/>
-                <w:szCs w:val="20"/>
-              </w:rPr>
-              <w:t xml:space="preserve">GAS</w:t>
+                <w:rFonts w:ascii="Arial" w:cs="Arial" w:eastAsia="Arial" w:hAnsi="Arial"/>
+                <w:sz w:val="20"/>
+                <w:szCs w:val="20"/>
+              </w:rPr>
+              <w:t xml:space="preserve">Frontend</w:t>
             </w:r>
           </w:p>
         </w:tc>
@@ -348,10 +368,11 @@
           <w:p>
             <w:r>
               <w:rPr>
-                <w:sz w:val="20"/>
-                <w:szCs w:val="20"/>
-              </w:rPr>
-              <w:t xml:space="preserve">Add searchFoods, getFavourites, toggleFavourite endpoints</w:t>
+                <w:rFonts w:ascii="Arial" w:cs="Arial" w:eastAsia="Arial" w:hAnsi="Arial"/>
+                <w:sz w:val="20"/>
+                <w:szCs w:val="20"/>
+              </w:rPr>
+              <w:t xml:space="preserve">New: full settings editor with 5 fields, validation, save</w:t>
             </w:r>
           </w:p>
         </w:tc>
@@ -376,10 +397,11 @@
           <w:p>
             <w:r>
               <w:rPr>
-                <w:sz w:val="20"/>
-                <w:szCs w:val="20"/>
-              </w:rPr>
-              <w:t xml:space="preserve">gas/config.gs</w:t>
+                <w:rFonts w:ascii="Arial" w:cs="Arial" w:eastAsia="Arial" w:hAnsi="Arial"/>
+                <w:sz w:val="20"/>
+                <w:szCs w:val="20"/>
+              </w:rPr>
+              <w:t xml:space="preserve">src/main.js</w:t>
             </w:r>
           </w:p>
         </w:tc>
@@ -402,10 +424,11 @@
           <w:p>
             <w:r>
               <w:rPr>
-                <w:sz w:val="20"/>
-                <w:szCs w:val="20"/>
-              </w:rPr>
-              <w:t xml:space="preserve">GAS</w:t>
+                <w:rFonts w:ascii="Arial" w:cs="Arial" w:eastAsia="Arial" w:hAnsi="Arial"/>
+                <w:sz w:val="20"/>
+                <w:szCs w:val="20"/>
+              </w:rPr>
+              <w:t xml:space="preserve">Frontend</w:t>
             </w:r>
           </w:p>
         </w:tc>
@@ -428,10 +451,11 @@
           <w:p>
             <w:r>
               <w:rPr>
-                <w:sz w:val="20"/>
-                <w:szCs w:val="20"/>
-              </w:rPr>
-              <w:t xml:space="preserve">Add full column indices for NutritionDB, CustomFoods, Favourites</w:t>
+                <w:rFonts w:ascii="Arial" w:cs="Arial" w:eastAsia="Arial" w:hAnsi="Arial"/>
+                <w:sz w:val="20"/>
+                <w:szCs w:val="20"/>
+              </w:rPr>
+              <w:t xml:space="preserve">Wire Settings tab to initSettings()</w:t>
             </w:r>
           </w:p>
         </w:tc>
@@ -456,10 +480,11 @@
           <w:p>
             <w:r>
               <w:rPr>
-                <w:sz w:val="20"/>
-                <w:szCs w:val="20"/>
-              </w:rPr>
-              <w:t xml:space="preserve">src/search.js</w:t>
+                <w:rFonts w:ascii="Arial" w:cs="Arial" w:eastAsia="Arial" w:hAnsi="Arial"/>
+                <w:sz w:val="20"/>
+                <w:szCs w:val="20"/>
+              </w:rPr>
+              <w:t xml:space="preserve">styles/main.css</w:t>
             </w:r>
           </w:p>
         </w:tc>
@@ -482,6 +507,7 @@
           <w:p>
             <w:r>
               <w:rPr>
+                <w:rFonts w:ascii="Arial" w:cs="Arial" w:eastAsia="Arial" w:hAnsi="Arial"/>
                 <w:sz w:val="20"/>
                 <w:szCs w:val="20"/>
               </w:rPr>
@@ -508,10 +534,11 @@
           <w:p>
             <w:r>
               <w:rPr>
-                <w:sz w:val="20"/>
-                <w:szCs w:val="20"/>
-              </w:rPr>
-              <w:t xml:space="preserve">New module: search UI, bottom sheet, favourite toggle</w:t>
+                <w:rFonts w:ascii="Arial" w:cs="Arial" w:eastAsia="Arial" w:hAnsi="Arial"/>
+                <w:sz w:val="20"/>
+                <w:szCs w:val="20"/>
+              </w:rPr>
+              <w:t xml:space="preserve">Append settings form styles</w:t>
             </w:r>
           </w:p>
         </w:tc>
@@ -536,10 +563,11 @@
           <w:p>
             <w:r>
               <w:rPr>
-                <w:sz w:val="20"/>
-                <w:szCs w:val="20"/>
-              </w:rPr>
-              <w:t xml:space="preserve">src/api.js</w:t>
+                <w:rFonts w:ascii="Arial" w:cs="Arial" w:eastAsia="Arial" w:hAnsi="Arial"/>
+                <w:sz w:val="20"/>
+                <w:szCs w:val="20"/>
+              </w:rPr>
+              <w:t xml:space="preserve">gas/Code.gs</w:t>
             </w:r>
           </w:p>
         </w:tc>
@@ -562,10 +590,11 @@
           <w:p>
             <w:r>
               <w:rPr>
-                <w:sz w:val="20"/>
-                <w:szCs w:val="20"/>
-              </w:rPr>
-              <w:t xml:space="preserve">Frontend</w:t>
+                <w:rFonts w:ascii="Arial" w:cs="Arial" w:eastAsia="Arial" w:hAnsi="Arial"/>
+                <w:sz w:val="20"/>
+                <w:szCs w:val="20"/>
+              </w:rPr>
+              <w:t xml:space="preserve">GAS</w:t>
             </w:r>
           </w:p>
         </w:tc>
@@ -588,250 +617,11 @@
           <w:p>
             <w:r>
               <w:rPr>
-                <w:sz w:val="20"/>
-                <w:szCs w:val="20"/>
-              </w:rPr>
-              <w:t xml:space="preserve">Add extraParams support; add B2 endpoint functions</w:t>
-            </w:r>
-          </w:p>
-        </w:tc>
-      </w:tr>
-      <w:tr>
-        <w:tc>
-          <w:tcPr>
-            <w:tcW w:type="dxa" w:w="3000"/>
-            <w:tcBorders>
-              <w:top w:val="single" w:color="CCCCCC" w:sz="1"/>
-              <w:left w:val="single" w:color="CCCCCC" w:sz="1"/>
-              <w:bottom w:val="single" w:color="CCCCCC" w:sz="1"/>
-              <w:right w:val="single" w:color="CCCCCC" w:sz="1"/>
-            </w:tcBorders>
-            <w:tcMar>
-              <w:top w:type="dxa" w:w="80"/>
-              <w:left w:type="dxa" w:w="120"/>
-              <w:bottom w:type="dxa" w:w="80"/>
-              <w:right w:type="dxa" w:w="120"/>
-            </w:tcMar>
-          </w:tcPr>
-          <w:p>
-            <w:r>
-              <w:rPr>
-                <w:sz w:val="20"/>
-                <w:szCs w:val="20"/>
-              </w:rPr>
-              <w:t xml:space="preserve">src/store.js</w:t>
-            </w:r>
-          </w:p>
-        </w:tc>
-        <w:tc>
-          <w:tcPr>
-            <w:tcW w:type="dxa" w:w="1800"/>
-            <w:tcBorders>
-              <w:top w:val="single" w:color="CCCCCC" w:sz="1"/>
-              <w:left w:val="single" w:color="CCCCCC" w:sz="1"/>
-              <w:bottom w:val="single" w:color="CCCCCC" w:sz="1"/>
-              <w:right w:val="single" w:color="CCCCCC" w:sz="1"/>
-            </w:tcBorders>
-            <w:tcMar>
-              <w:top w:type="dxa" w:w="80"/>
-              <w:left w:type="dxa" w:w="120"/>
-              <w:bottom w:type="dxa" w:w="80"/>
-              <w:right w:type="dxa" w:w="120"/>
-            </w:tcMar>
-          </w:tcPr>
-          <w:p>
-            <w:r>
-              <w:rPr>
-                <w:sz w:val="20"/>
-                <w:szCs w:val="20"/>
-              </w:rPr>
-              <w:t xml:space="preserve">Frontend</w:t>
-            </w:r>
-          </w:p>
-        </w:tc>
-        <w:tc>
-          <w:tcPr>
-            <w:tcW w:type="dxa" w:w="4560"/>
-            <w:tcBorders>
-              <w:top w:val="single" w:color="CCCCCC" w:sz="1"/>
-              <w:left w:val="single" w:color="CCCCCC" w:sz="1"/>
-              <w:bottom w:val="single" w:color="CCCCCC" w:sz="1"/>
-              <w:right w:val="single" w:color="CCCCCC" w:sz="1"/>
-            </w:tcBorders>
-            <w:tcMar>
-              <w:top w:type="dxa" w:w="80"/>
-              <w:left w:type="dxa" w:w="120"/>
-              <w:bottom w:type="dxa" w:w="80"/>
-              <w:right w:type="dxa" w:w="120"/>
-            </w:tcMar>
-          </w:tcPr>
-          <w:p>
-            <w:r>
-              <w:rPr>
-                <w:sz w:val="20"/>
-                <w:szCs w:val="20"/>
-              </w:rPr>
-              <w:t xml:space="preserve">Add foods/favourites state; add getToken/setToken/clearToken</w:t>
-            </w:r>
-          </w:p>
-        </w:tc>
-      </w:tr>
-      <w:tr>
-        <w:tc>
-          <w:tcPr>
-            <w:tcW w:type="dxa" w:w="3000"/>
-            <w:tcBorders>
-              <w:top w:val="single" w:color="CCCCCC" w:sz="1"/>
-              <w:left w:val="single" w:color="CCCCCC" w:sz="1"/>
-              <w:bottom w:val="single" w:color="CCCCCC" w:sz="1"/>
-              <w:right w:val="single" w:color="CCCCCC" w:sz="1"/>
-            </w:tcBorders>
-            <w:tcMar>
-              <w:top w:type="dxa" w:w="80"/>
-              <w:left w:type="dxa" w:w="120"/>
-              <w:bottom w:type="dxa" w:w="80"/>
-              <w:right w:type="dxa" w:w="120"/>
-            </w:tcMar>
-          </w:tcPr>
-          <w:p>
-            <w:r>
-              <w:rPr>
-                <w:sz w:val="20"/>
-                <w:szCs w:val="20"/>
-              </w:rPr>
-              <w:t xml:space="preserve">src/main.js</w:t>
-            </w:r>
-          </w:p>
-        </w:tc>
-        <w:tc>
-          <w:tcPr>
-            <w:tcW w:type="dxa" w:w="1800"/>
-            <w:tcBorders>
-              <w:top w:val="single" w:color="CCCCCC" w:sz="1"/>
-              <w:left w:val="single" w:color="CCCCCC" w:sz="1"/>
-              <w:bottom w:val="single" w:color="CCCCCC" w:sz="1"/>
-              <w:right w:val="single" w:color="CCCCCC" w:sz="1"/>
-            </w:tcBorders>
-            <w:tcMar>
-              <w:top w:type="dxa" w:w="80"/>
-              <w:left w:type="dxa" w:w="120"/>
-              <w:bottom w:type="dxa" w:w="80"/>
-              <w:right w:type="dxa" w:w="120"/>
-            </w:tcMar>
-          </w:tcPr>
-          <w:p>
-            <w:r>
-              <w:rPr>
-                <w:sz w:val="20"/>
-                <w:szCs w:val="20"/>
-              </w:rPr>
-              <w:t xml:space="preserve">Frontend</w:t>
-            </w:r>
-          </w:p>
-        </w:tc>
-        <w:tc>
-          <w:tcPr>
-            <w:tcW w:type="dxa" w:w="4560"/>
-            <w:tcBorders>
-              <w:top w:val="single" w:color="CCCCCC" w:sz="1"/>
-              <w:left w:val="single" w:color="CCCCCC" w:sz="1"/>
-              <w:bottom w:val="single" w:color="CCCCCC" w:sz="1"/>
-              <w:right w:val="single" w:color="CCCCCC" w:sz="1"/>
-            </w:tcBorders>
-            <w:tcMar>
-              <w:top w:type="dxa" w:w="80"/>
-              <w:left w:type="dxa" w:w="120"/>
-              <w:bottom w:type="dxa" w:w="80"/>
-              <w:right w:type="dxa" w:w="120"/>
-            </w:tcMar>
-          </w:tcPr>
-          <w:p>
-            <w:r>
-              <w:rPr>
-                <w:sz w:val="20"/>
-                <w:szCs w:val="20"/>
-              </w:rPr>
-              <w:t xml:space="preserve">Async navigateTo; wire Search tab to initSearch()</w:t>
-            </w:r>
-          </w:p>
-        </w:tc>
-      </w:tr>
-      <w:tr>
-        <w:tc>
-          <w:tcPr>
-            <w:tcW w:type="dxa" w:w="3000"/>
-            <w:tcBorders>
-              <w:top w:val="single" w:color="CCCCCC" w:sz="1"/>
-              <w:left w:val="single" w:color="CCCCCC" w:sz="1"/>
-              <w:bottom w:val="single" w:color="CCCCCC" w:sz="1"/>
-              <w:right w:val="single" w:color="CCCCCC" w:sz="1"/>
-            </w:tcBorders>
-            <w:tcMar>
-              <w:top w:type="dxa" w:w="80"/>
-              <w:left w:type="dxa" w:w="120"/>
-              <w:bottom w:type="dxa" w:w="80"/>
-              <w:right w:type="dxa" w:w="120"/>
-            </w:tcMar>
-          </w:tcPr>
-          <w:p>
-            <w:r>
-              <w:rPr>
-                <w:sz w:val="20"/>
-                <w:szCs w:val="20"/>
-              </w:rPr>
-              <w:t xml:space="preserve">styles/main.css</w:t>
-            </w:r>
-          </w:p>
-        </w:tc>
-        <w:tc>
-          <w:tcPr>
-            <w:tcW w:type="dxa" w:w="1800"/>
-            <w:tcBorders>
-              <w:top w:val="single" w:color="CCCCCC" w:sz="1"/>
-              <w:left w:val="single" w:color="CCCCCC" w:sz="1"/>
-              <w:bottom w:val="single" w:color="CCCCCC" w:sz="1"/>
-              <w:right w:val="single" w:color="CCCCCC" w:sz="1"/>
-            </w:tcBorders>
-            <w:tcMar>
-              <w:top w:type="dxa" w:w="80"/>
-              <w:left w:type="dxa" w:w="120"/>
-              <w:bottom w:type="dxa" w:w="80"/>
-              <w:right w:type="dxa" w:w="120"/>
-            </w:tcMar>
-          </w:tcPr>
-          <w:p>
-            <w:r>
-              <w:rPr>
-                <w:sz w:val="20"/>
-                <w:szCs w:val="20"/>
-              </w:rPr>
-              <w:t xml:space="preserve">Frontend</w:t>
-            </w:r>
-          </w:p>
-        </w:tc>
-        <w:tc>
-          <w:tcPr>
-            <w:tcW w:type="dxa" w:w="4560"/>
-            <w:tcBorders>
-              <w:top w:val="single" w:color="CCCCCC" w:sz="1"/>
-              <w:left w:val="single" w:color="CCCCCC" w:sz="1"/>
-              <w:bottom w:val="single" w:color="CCCCCC" w:sz="1"/>
-              <w:right w:val="single" w:color="CCCCCC" w:sz="1"/>
-            </w:tcBorders>
-            <w:tcMar>
-              <w:top w:type="dxa" w:w="80"/>
-              <w:left w:type="dxa" w:w="120"/>
-              <w:bottom w:type="dxa" w:w="80"/>
-              <w:right w:type="dxa" w:w="120"/>
-            </w:tcMar>
-          </w:tcPr>
-          <w:p>
-            <w:r>
-              <w:rPr>
-                <w:sz w:val="20"/>
-                <w:szCs w:val="20"/>
-              </w:rPr>
-              <w:t xml:space="preserve">Append search results, bottom sheet styles</w:t>
+                <w:rFonts w:ascii="Arial" w:cs="Arial" w:eastAsia="Arial" w:hAnsi="Arial"/>
+                <w:sz w:val="20"/>
+                <w:szCs w:val="20"/>
+              </w:rPr>
+              <w:t xml:space="preserve">Fix updateSettings: read from payload.settings not payload top-level</w:t>
             </w:r>
           </w:p>
         </w:tc>
@@ -839,7 +629,7 @@
     </w:tbl>
     <w:p>
       <w:pPr>
-        <w:spacing w:after="80"/>
+        <w:spacing w:after="120"/>
       </w:pPr>
       <w:r>
         <w:t xml:space="preserve"/>
@@ -847,10 +637,11 @@
     </w:p>
     <w:p>
       <w:pPr>
-        <w:spacing w:after="120"/>
-      </w:pPr>
-      <w:r>
-        <w:rPr>
+        <w:spacing w:after="100"/>
+      </w:pPr>
+      <w:r>
+        <w:rPr>
+          <w:rFonts w:ascii="Arial" w:cs="Arial" w:eastAsia="Arial" w:hAnsi="Arial"/>
           <w:b/>
           <w:bCs/>
           <w:sz w:val="20"/>
@@ -861,89 +652,90 @@
     </w:p>
     <w:p>
       <w:pPr>
+        <w:pStyle w:val="ListParagraph"/>
+        <w:numPr>
+          <w:ilvl w:val="0"/>
+          <w:numId w:val="2"/>
+        </w:numPr>
+        <w:spacing w:after="80"/>
+      </w:pPr>
+      <w:r>
+        <w:rPr>
+          <w:rFonts w:ascii="Arial" w:cs="Arial" w:eastAsia="Arial" w:hAnsi="Arial"/>
+          <w:sz w:val="20"/>
+          <w:szCs w:val="20"/>
+        </w:rPr>
+        <w:t xml:space="preserve">updateSettings (GAS): was iterating payload top-level keys, writing "settings" as a key; fixed to read payload.settings object</w:t>
+      </w:r>
+    </w:p>
+    <w:p>
+      <w:pPr>
+        <w:pStyle w:val="ListParagraph"/>
+        <w:numPr>
+          <w:ilvl w:val="0"/>
+          <w:numId w:val="2"/>
+        </w:numPr>
+        <w:spacing w:after="80"/>
+      </w:pPr>
+      <w:r>
+        <w:rPr>
+          <w:rFonts w:ascii="Arial" w:cs="Arial" w:eastAsia="Arial" w:hAnsi="Arial"/>
+          <w:sz w:val="20"/>
+          <w:szCs w:val="20"/>
+        </w:rPr>
+        <w:t xml:space="preserve">Settings sheet: removed dirty row 11 (settings | {calorie_target=2200.0}) left by the bug</w:t>
+      </w:r>
+    </w:p>
+    <w:p>
+      <w:pPr>
+        <w:pStyle w:val="ListParagraph"/>
+        <w:numPr>
+          <w:ilvl w:val="0"/>
+          <w:numId w:val="2"/>
+        </w:numPr>
+        <w:spacing w:after="80"/>
+      </w:pPr>
+      <w:r>
+        <w:rPr>
+          <w:rFonts w:ascii="Arial" w:cs="Arial" w:eastAsia="Arial" w:hAnsi="Arial"/>
+          <w:sz w:val="20"/>
+          <w:szCs w:val="20"/>
+        </w:rPr>
+        <w:t xml:space="preserve">Fibre max raised from 100 to 200 to allow valid 3-digit inputs</w:t>
+      </w:r>
+    </w:p>
+    <w:p>
+      <w:pPr>
+        <w:pStyle w:val="ListParagraph"/>
+        <w:numPr>
+          <w:ilvl w:val="0"/>
+          <w:numId w:val="2"/>
+        </w:numPr>
+        <w:spacing w:after="80"/>
+      </w:pPr>
+      <w:r>
+        <w:rPr>
+          <w:rFonts w:ascii="Arial" w:cs="Arial" w:eastAsia="Arial" w:hAnsi="Arial"/>
+          <w:sz w:val="20"/>
+          <w:szCs w:val="20"/>
+        </w:rPr>
+        <w:t xml:space="preserve">Removed Sodium and Potassium from Settings UI (not needed for daily tracking)</w:t>
+      </w:r>
+    </w:p>
+    <w:p>
+      <w:pPr>
         <w:spacing w:after="120"/>
       </w:pPr>
       <w:r>
-        <w:rPr>
-          <w:sz w:val="20"/>
-          <w:szCs w:val="20"/>
-        </w:rPr>
-        <w:t xml:space="preserve">• verifyPin: hash was read from params.hash (wrong); fixed to read from JSON.parse(params.payload).hash</w:t>
-      </w:r>
-    </w:p>
-    <w:p>
-      <w:pPr>
-        <w:spacing w:after="120"/>
-      </w:pPr>
-      <w:r>
-        <w:rPr>
-          <w:sz w:val="20"/>
-          <w:szCs w:val="20"/>
-        </w:rPr>
-        <w:t xml:space="preserve">• searchFoods: q param incorrectly sent in payload; fixed to use extraParams (direct URL param)</w:t>
-      </w:r>
-    </w:p>
-    <w:p>
-      <w:pPr>
-        <w:spacing w:after="120"/>
-      </w:pPr>
-      <w:r>
-        <w:rPr>
-          <w:sz w:val="20"/>
-          <w:szCs w:val="20"/>
-        </w:rPr>
-        <w:t xml:space="preserve">• toggleFavourite: foodNo incorrectly read from params; fixed to read from payload</w:t>
-      </w:r>
-    </w:p>
-    <w:p>
-      <w:pPr>
-        <w:spacing w:after="120"/>
-      </w:pPr>
-      <w:r>
-        <w:rPr>
-          <w:sz w:val="20"/>
-          <w:szCs w:val="20"/>
-        </w:rPr>
-        <w:t xml:space="preserve">• store.js: missing clearToken() method (required by auth.js logout)</w:t>
-      </w:r>
-    </w:p>
-    <w:p>
-      <w:pPr>
-        <w:spacing w:after="80"/>
-      </w:pPr>
-      <w:r>
         <w:t xml:space="preserve"/>
       </w:r>
     </w:p>
     <w:p>
       <w:pPr>
-        <w:spacing w:after="120"/>
-      </w:pPr>
-      <w:r>
-        <w:rPr>
-          <w:b/>
-          <w:bCs/>
-          <w:sz w:val="20"/>
-          <w:szCs w:val="20"/>
-        </w:rPr>
-        <w:t xml:space="preserve">Schema Changes:</w:t>
-      </w:r>
-    </w:p>
-    <w:p>
-      <w:pPr>
-        <w:spacing w:after="120"/>
-      </w:pPr>
-      <w:r>
-        <w:rPr>
-          <w:sz w:val="20"/>
-          <w:szCs w:val="20"/>
-        </w:rPr>
-        <w:t xml:space="preserve">• CustomFoods: removed DATE column (A); CREATED_DATETIME retained at column M</w:t>
-      </w:r>
-    </w:p>
-    <w:p>
-      <w:pPr>
-        <w:spacing w:after="80"/>
+        <w:pBdr>
+          <w:bottom w:val="single" w:color="D8E4D0" w:sz="4" w:space="1"/>
+        </w:pBdr>
+        <w:spacing w:after="160"/>
       </w:pPr>
       <w:r>
         <w:t xml:space="preserve"/>
@@ -951,40 +743,27 @@
     </w:p>
     <w:p>
       <w:pPr>
-        <w:pBdr>
-          <w:bottom w:val="single" w:color="D8E4D0" w:sz="4"/>
-        </w:pBdr>
-      </w:pPr>
-    </w:p>
-    <w:p>
-      <w:pPr>
-        <w:spacing w:after="80"/>
-      </w:pPr>
-      <w:r>
-        <w:t xml:space="preserve"/>
-      </w:r>
-    </w:p>
-    <w:p>
-      <w:pPr>
         <w:pStyle w:val="Heading2"/>
       </w:pPr>
       <w:r>
         <w:rPr>
+          <w:rFonts w:ascii="Arial" w:cs="Arial" w:eastAsia="Arial" w:hAnsi="Arial"/>
           <w:b/>
           <w:bCs/>
           <w:color w:val="697A58"/>
           <w:sz w:val="24"/>
           <w:szCs w:val="24"/>
         </w:rPr>
-        <w:t xml:space="preserve">B1 · Auth + Skeleton  —  2026-03-22</w:t>
-      </w:r>
-    </w:p>
-    <w:p>
-      <w:pPr>
-        <w:spacing w:after="120"/>
-      </w:pPr>
-      <w:r>
-        <w:rPr>
+        <w:t xml:space="preserve">B2 · Food Search  —  2026-03-23</w:t>
+      </w:r>
+    </w:p>
+    <w:p>
+      <w:pPr>
+        <w:spacing w:after="100"/>
+      </w:pPr>
+      <w:r>
+        <w:rPr>
+          <w:rFonts w:ascii="Arial" w:cs="Arial" w:eastAsia="Arial" w:hAnsi="Arial"/>
           <w:b/>
           <w:bCs/>
           <w:sz w:val="20"/>
@@ -995,81 +774,118 @@
     </w:p>
     <w:p>
       <w:pPr>
+        <w:pStyle w:val="ListParagraph"/>
+        <w:numPr>
+          <w:ilvl w:val="0"/>
+          <w:numId w:val="2"/>
+        </w:numPr>
+        <w:spacing w:after="80"/>
+      </w:pPr>
+      <w:r>
+        <w:rPr>
+          <w:rFonts w:ascii="Arial" w:cs="Arial" w:eastAsia="Arial" w:hAnsi="Arial"/>
+          <w:sz w:val="20"/>
+          <w:szCs w:val="20"/>
+        </w:rPr>
+        <w:t xml:space="preserve">Full NutritionDB + CustomFoods search with client-side cache</w:t>
+      </w:r>
+    </w:p>
+    <w:p>
+      <w:pPr>
+        <w:pStyle w:val="ListParagraph"/>
+        <w:numPr>
+          <w:ilvl w:val="0"/>
+          <w:numId w:val="2"/>
+        </w:numPr>
+        <w:spacing w:after="80"/>
+      </w:pPr>
+      <w:r>
+        <w:rPr>
+          <w:rFonts w:ascii="Arial" w:cs="Arial" w:eastAsia="Arial" w:hAnsi="Arial"/>
+          <w:sz w:val="20"/>
+          <w:szCs w:val="20"/>
+        </w:rPr>
+        <w:t xml:space="preserve">Favourites toggle, persisted to Sheets, sort-first in results</w:t>
+      </w:r>
+    </w:p>
+    <w:p>
+      <w:pPr>
+        <w:pStyle w:val="ListParagraph"/>
+        <w:numPr>
+          <w:ilvl w:val="0"/>
+          <w:numId w:val="2"/>
+        </w:numPr>
+        <w:spacing w:after="80"/>
+      </w:pPr>
+      <w:r>
+        <w:rPr>
+          <w:rFonts w:ascii="Arial" w:cs="Arial" w:eastAsia="Arial" w:hAnsi="Arial"/>
+          <w:sz w:val="20"/>
+          <w:szCs w:val="20"/>
+        </w:rPr>
+        <w:t xml:space="preserve">Bottom sheet: amount input + meal type selector</w:t>
+      </w:r>
+    </w:p>
+    <w:p>
+      <w:pPr>
+        <w:pStyle w:val="ListParagraph"/>
+        <w:numPr>
+          <w:ilvl w:val="0"/>
+          <w:numId w:val="2"/>
+        </w:numPr>
+        <w:spacing w:after="80"/>
+      </w:pPr>
+      <w:r>
+        <w:rPr>
+          <w:rFonts w:ascii="Arial" w:cs="Arial" w:eastAsia="Arial" w:hAnsi="Arial"/>
+          <w:sz w:val="20"/>
+          <w:szCs w:val="20"/>
+        </w:rPr>
+        <w:t xml:space="preserve">Bugs fixed: verifyPin payload, searchFoods URL param, toggleFavourite payload, clearToken()</w:t>
+      </w:r>
+    </w:p>
+    <w:p>
+      <w:pPr>
         <w:spacing w:after="120"/>
       </w:pPr>
       <w:r>
-        <w:rPr>
-          <w:sz w:val="20"/>
-          <w:szCs w:val="20"/>
-        </w:rPr>
-        <w:t xml:space="preserve">• PIN login with SHA-256 hash, sessionStorage token</w:t>
-      </w:r>
-    </w:p>
-    <w:p>
-      <w:pPr>
-        <w:spacing w:after="120"/>
-      </w:pPr>
-      <w:r>
-        <w:rPr>
-          <w:sz w:val="20"/>
-          <w:szCs w:val="20"/>
-        </w:rPr>
-        <w:t xml:space="preserve">• App shell with 5-tab navigation (Today / Search / Meals / History / Settings)</w:t>
-      </w:r>
-    </w:p>
-    <w:p>
-      <w:pPr>
-        <w:spacing w:after="120"/>
-      </w:pPr>
-      <w:r>
-        <w:rPr>
-          <w:sz w:val="20"/>
-          <w:szCs w:val="20"/>
-        </w:rPr>
-        <w:t xml:space="preserve">• Settings page reads nutrition targets from Google Sheets</w:t>
-      </w:r>
-    </w:p>
-    <w:p>
-      <w:pPr>
-        <w:spacing w:after="120"/>
-      </w:pPr>
-      <w:r>
-        <w:rPr>
-          <w:sz w:val="20"/>
-          <w:szCs w:val="20"/>
-        </w:rPr>
-        <w:t xml:space="preserve">• Files: gas/Code.gs, gas/config.gs, src/auth.js, src/api.js, src/store.js, src/main.js, styles/</w:t>
-      </w:r>
-    </w:p>
-    <w:p>
-      <w:pPr>
-        <w:spacing w:after="80"/>
-      </w:pPr>
-      <w:r>
         <w:t xml:space="preserve"/>
       </w:r>
     </w:p>
     <w:p>
       <w:pPr>
+        <w:pBdr>
+          <w:bottom w:val="single" w:color="D8E4D0" w:sz="4" w:space="1"/>
+        </w:pBdr>
+        <w:spacing w:after="160"/>
+      </w:pPr>
+      <w:r>
+        <w:t xml:space="preserve"/>
+      </w:r>
+    </w:p>
+    <w:p>
+      <w:pPr>
         <w:pStyle w:val="Heading2"/>
       </w:pPr>
       <w:r>
         <w:rPr>
+          <w:rFonts w:ascii="Arial" w:cs="Arial" w:eastAsia="Arial" w:hAnsi="Arial"/>
           <w:b/>
           <w:bCs/>
           <w:color w:val="697A58"/>
           <w:sz w:val="24"/>
           <w:szCs w:val="24"/>
         </w:rPr>
-        <w:t xml:space="preserve">B0 · Infrastructure  —  2026-03-22</w:t>
-      </w:r>
-    </w:p>
-    <w:p>
-      <w:pPr>
-        <w:spacing w:after="120"/>
-      </w:pPr>
-      <w:r>
-        <w:rPr>
+        <w:t xml:space="preserve">B1 · Auth + Skeleton  —  2026-03-22</w:t>
+      </w:r>
+    </w:p>
+    <w:p>
+      <w:pPr>
+        <w:spacing w:after="100"/>
+      </w:pPr>
+      <w:r>
+        <w:rPr>
+          <w:rFonts w:ascii="Arial" w:cs="Arial" w:eastAsia="Arial" w:hAnsi="Arial"/>
           <w:b/>
           <w:bCs/>
           <w:sz w:val="20"/>
@@ -1080,50 +896,88 @@
     </w:p>
     <w:p>
       <w:pPr>
+        <w:pStyle w:val="ListParagraph"/>
+        <w:numPr>
+          <w:ilvl w:val="0"/>
+          <w:numId w:val="2"/>
+        </w:numPr>
+        <w:spacing w:after="80"/>
+      </w:pPr>
+      <w:r>
+        <w:rPr>
+          <w:rFonts w:ascii="Arial" w:cs="Arial" w:eastAsia="Arial" w:hAnsi="Arial"/>
+          <w:sz w:val="20"/>
+          <w:szCs w:val="20"/>
+        </w:rPr>
+        <w:t xml:space="preserve">PIN login with SHA-256, sessionStorage token, 5-tab navigation</w:t>
+      </w:r>
+    </w:p>
+    <w:p>
+      <w:pPr>
         <w:spacing w:after="120"/>
       </w:pPr>
       <w:r>
-        <w:rPr>
-          <w:sz w:val="20"/>
-          <w:szCs w:val="20"/>
-        </w:rPr>
-        <w:t xml:space="preserve">• GitHub repo + GitHub Pages hosting</w:t>
-      </w:r>
-    </w:p>
-    <w:p>
-      <w:pPr>
-        <w:spacing w:after="120"/>
-      </w:pPr>
-      <w:r>
-        <w:rPr>
-          <w:sz w:val="20"/>
-          <w:szCs w:val="20"/>
-        </w:rPr>
-        <w:t xml:space="preserve">• Google Apps Script project created and deployed</w:t>
-      </w:r>
-    </w:p>
-    <w:p>
-      <w:pPr>
-        <w:spacing w:after="120"/>
-      </w:pPr>
-      <w:r>
-        <w:rPr>
-          <w:sz w:val="20"/>
-          <w:szCs w:val="20"/>
-        </w:rPr>
-        <w:t xml:space="preserve">• 8 Google Sheets tabs scaffolded with correct column headers</w:t>
-      </w:r>
-    </w:p>
-    <w:p>
-      <w:pPr>
-        <w:spacing w:after="120"/>
-      </w:pPr>
-      <w:r>
-        <w:rPr>
-          <w:sz w:val="20"/>
-          <w:szCs w:val="20"/>
-        </w:rPr>
-        <w:t xml:space="preserve">• Settings sheet seeded with default nutrition targets</w:t>
+        <w:t xml:space="preserve"/>
+      </w:r>
+    </w:p>
+    <w:p>
+      <w:pPr>
+        <w:pBdr>
+          <w:bottom w:val="single" w:color="D8E4D0" w:sz="4" w:space="1"/>
+        </w:pBdr>
+        <w:spacing w:after="160"/>
+      </w:pPr>
+      <w:r>
+        <w:t xml:space="preserve"/>
+      </w:r>
+    </w:p>
+    <w:p>
+      <w:pPr>
+        <w:pStyle w:val="Heading2"/>
+      </w:pPr>
+      <w:r>
+        <w:rPr>
+          <w:rFonts w:ascii="Arial" w:cs="Arial" w:eastAsia="Arial" w:hAnsi="Arial"/>
+          <w:b/>
+          <w:bCs/>
+          <w:color w:val="697A58"/>
+          <w:sz w:val="24"/>
+          <w:szCs w:val="24"/>
+        </w:rPr>
+        <w:t xml:space="preserve">B0 · Infrastructure  —  2026-03-22</w:t>
+      </w:r>
+    </w:p>
+    <w:p>
+      <w:pPr>
+        <w:spacing w:after="100"/>
+      </w:pPr>
+      <w:r>
+        <w:rPr>
+          <w:rFonts w:ascii="Arial" w:cs="Arial" w:eastAsia="Arial" w:hAnsi="Arial"/>
+          <w:b/>
+          <w:bCs/>
+          <w:sz w:val="20"/>
+          <w:szCs w:val="20"/>
+        </w:rPr>
+        <w:t xml:space="preserve">Status: COMPLETE</w:t>
+      </w:r>
+    </w:p>
+    <w:p>
+      <w:pPr>
+        <w:pStyle w:val="ListParagraph"/>
+        <w:numPr>
+          <w:ilvl w:val="0"/>
+          <w:numId w:val="2"/>
+        </w:numPr>
+        <w:spacing w:after="80"/>
+      </w:pPr>
+      <w:r>
+        <w:rPr>
+          <w:rFonts w:ascii="Arial" w:cs="Arial" w:eastAsia="Arial" w:hAnsi="Arial"/>
+          <w:sz w:val="20"/>
+          <w:szCs w:val="20"/>
+        </w:rPr>
+        <w:t xml:space="preserve">GitHub Pages, Apps Script, 8 Sheets tabs, default Settings data</w:t>
       </w:r>
     </w:p>
     <w:sectPr>
@@ -1263,8 +1117,26 @@
       </w:pPr>
     </w:lvl>
   </w:abstractNum>
+  <w:abstractNum w:abstractNumId="2" w15:restartNumberingAfterBreak="0">
+    <w:multiLevelType w:val="hybridMultilevel"/>
+    <w:lvl w:ilvl="0" w15:tentative="1">
+      <w:start w:val="1"/>
+      <w:numFmt w:val="bullet"/>
+      <w:lvlText w:val="•"/>
+      <w:lvlJc w:val="left"/>
+      <w:pPr>
+        <w:ind w:left="720" w:hanging="360"/>
+      </w:pPr>
+    </w:lvl>
+  </w:abstractNum>
   <w:num w:numId="1">
     <w:abstractNumId w:val="1"/>
+    <w:lvlOverride w:ilvl="0">
+      <w:startOverride w:val="1"/>
+    </w:lvlOverride>
+  </w:num>
+  <w:num w:numId="2">
+    <w:abstractNumId w:val="2"/>
     <w:lvlOverride w:ilvl="0">
       <w:startOverride w:val="1"/>
     </w:lvlOverride>
@@ -1424,7 +1296,7 @@
     <w:next w:val="Normal"/>
     <w:qFormat/>
     <w:pPr>
-      <w:spacing w:before="240" w:after="120"/>
+      <w:spacing w:before="280" w:after="140"/>
       <w:outlineLvl w:val="0"/>
     </w:pPr>
     <w:rPr>
@@ -1442,7 +1314,7 @@
     <w:next w:val="Normal"/>
     <w:qFormat/>
     <w:pPr>
-      <w:spacing w:before="180" w:after="80"/>
+      <w:spacing w:before="200" w:after="100"/>
       <w:outlineLvl w:val="1"/>
     </w:pPr>
     <w:rPr>

</xml_diff>

<commit_message>
docs: B4 complete - update CLAUDE.md, Changelog, OperationsRunbook v1.4
</commit_message>
<xml_diff>
--- a/docs/NutriLog_Changelog_v1.0.docx
+++ b/docs/NutriLog_Changelog_v1.0.docx
@@ -52,7 +52,7 @@
           <w:sz w:val="24"/>
           <w:szCs w:val="24"/>
         </w:rPr>
-        <w:t xml:space="preserve">B3 · Settings Editor  —  2026-03-23</w:t>
+        <w:t xml:space="preserve">B4 · Today Log Display  —  2026-03-23</w:t>
       </w:r>
     </w:p>
     <w:p>
@@ -108,7 +108,7 @@
           <w:sz w:val="20"/>
           <w:szCs w:val="20"/>
         </w:rPr>
-        <w:t xml:space="preserve">Settings page: 5 editable nutrition target fields (Calories / Protein / Carbs / Fat / Fibre)</w:t>
+        <w:t xml:space="preserve">Today tab: reads DailyLog sheet and displays entries grouped by meal type</w:t>
       </w:r>
     </w:p>
     <w:p>
@@ -126,7 +126,7 @@
           <w:sz w:val="20"/>
           <w:szCs w:val="20"/>
         </w:rPr>
-        <w:t xml:space="preserve">Save button writes to Google Sheets Settings tab via updateSettings endpoint</w:t>
+        <w:t xml:space="preserve">Date navigation: left/right arrows to browse any date</w:t>
       </w:r>
     </w:p>
     <w:p>
@@ -144,7 +144,7 @@
           <w:sz w:val="20"/>
           <w:szCs w:val="20"/>
         </w:rPr>
-        <w:t xml:space="preserve">Values persist across sessions — reloading reads from Sheets</w:t>
+        <w:t xml:space="preserve">Summary strip: 5 macro progress bars (Calories/Protein/Carbs/Fat/Fibre) with colour thresholds</w:t>
       </w:r>
     </w:p>
     <w:p>
@@ -162,7 +162,43 @@
           <w:sz w:val="20"/>
           <w:szCs w:val="20"/>
         </w:rPr>
-        <w:t xml:space="preserve">Input validation with error highlight on out-of-range values</w:t>
+        <w:t xml:space="preserve">Entry rows: food name, amount, kcal, P/C/F macros, Na/K minerals</w:t>
+      </w:r>
+    </w:p>
+    <w:p>
+      <w:pPr>
+        <w:pStyle w:val="ListParagraph"/>
+        <w:numPr>
+          <w:ilvl w:val="0"/>
+          <w:numId w:val="2"/>
+        </w:numPr>
+        <w:spacing w:after="80"/>
+      </w:pPr>
+      <w:r>
+        <w:rPr>
+          <w:rFonts w:ascii="Arial" w:cs="Arial" w:eastAsia="Arial" w:hAnsi="Arial"/>
+          <w:sz w:val="20"/>
+          <w:szCs w:val="20"/>
+        </w:rPr>
+        <w:t xml:space="preserve">Empty state displayed for dates with no entries</w:t>
+      </w:r>
+    </w:p>
+    <w:p>
+      <w:pPr>
+        <w:pStyle w:val="ListParagraph"/>
+        <w:numPr>
+          <w:ilvl w:val="0"/>
+          <w:numId w:val="2"/>
+        </w:numPr>
+        <w:spacing w:after="80"/>
+      </w:pPr>
+      <w:r>
+        <w:rPr>
+          <w:rFonts w:ascii="Arial" w:cs="Arial" w:eastAsia="Arial" w:hAnsi="Arial"/>
+          <w:sz w:val="20"/>
+          <w:szCs w:val="20"/>
+        </w:rPr>
+        <w:t xml:space="preserve">Client-side cache: daily log cached in store.state.dailyLog per date</w:t>
       </w:r>
     </w:p>
     <w:p>
@@ -318,7 +354,7 @@
                 <w:sz w:val="20"/>
                 <w:szCs w:val="20"/>
               </w:rPr>
-              <w:t xml:space="preserve">src/settings.js</w:t>
+              <w:t xml:space="preserve">gas/Code.gs</w:t>
             </w:r>
           </w:p>
         </w:tc>
@@ -345,7 +381,7 @@
                 <w:sz w:val="20"/>
                 <w:szCs w:val="20"/>
               </w:rPr>
-              <w:t xml:space="preserve">Frontend</w:t>
+              <w:t xml:space="preserve">GAS</w:t>
             </w:r>
           </w:p>
         </w:tc>
@@ -372,7 +408,7 @@
                 <w:sz w:val="20"/>
                 <w:szCs w:val="20"/>
               </w:rPr>
-              <w:t xml:space="preserve">New: full settings editor with 5 fields, validation, save</w:t>
+              <w:t xml:space="preserve">Add getDailyLog endpoint</w:t>
             </w:r>
           </w:p>
         </w:tc>
@@ -401,7 +437,7 @@
                 <w:sz w:val="20"/>
                 <w:szCs w:val="20"/>
               </w:rPr>
-              <w:t xml:space="preserve">src/main.js</w:t>
+              <w:t xml:space="preserve">gas/config.gs</w:t>
             </w:r>
           </w:p>
         </w:tc>
@@ -428,7 +464,7 @@
                 <w:sz w:val="20"/>
                 <w:szCs w:val="20"/>
               </w:rPr>
-              <w:t xml:space="preserve">Frontend</w:t>
+              <w:t xml:space="preserve">GAS</w:t>
             </w:r>
           </w:p>
         </w:tc>
@@ -455,7 +491,7 @@
                 <w:sz w:val="20"/>
                 <w:szCs w:val="20"/>
               </w:rPr>
-              <w:t xml:space="preserve">Wire Settings tab to initSettings()</w:t>
+              <w:t xml:space="preserve">Add dailyLog column indices (no MEAL_NO, NAME at index 3)</w:t>
             </w:r>
           </w:p>
         </w:tc>
@@ -484,7 +520,7 @@
                 <w:sz w:val="20"/>
                 <w:szCs w:val="20"/>
               </w:rPr>
-              <w:t xml:space="preserve">styles/main.css</w:t>
+              <w:t xml:space="preserve">src/log.js</w:t>
             </w:r>
           </w:p>
         </w:tc>
@@ -538,7 +574,7 @@
                 <w:sz w:val="20"/>
                 <w:szCs w:val="20"/>
               </w:rPr>
-              <w:t xml:space="preserve">Append settings form styles</w:t>
+              <w:t xml:space="preserve">New: Today log page, date nav, summary strip, meal sections, entry rows</w:t>
             </w:r>
           </w:p>
         </w:tc>
@@ -567,7 +603,7 @@
                 <w:sz w:val="20"/>
                 <w:szCs w:val="20"/>
               </w:rPr>
-              <w:t xml:space="preserve">gas/Code.gs</w:t>
+              <w:t xml:space="preserve">src/api.js</w:t>
             </w:r>
           </w:p>
         </w:tc>
@@ -594,7 +630,7 @@
                 <w:sz w:val="20"/>
                 <w:szCs w:val="20"/>
               </w:rPr>
-              <w:t xml:space="preserve">GAS</w:t>
+              <w:t xml:space="preserve">Frontend</w:t>
             </w:r>
           </w:p>
         </w:tc>
@@ -621,7 +657,256 @@
                 <w:sz w:val="20"/>
                 <w:szCs w:val="20"/>
               </w:rPr>
-              <w:t xml:space="preserve">Fix updateSettings: read from payload.settings not payload top-level</w:t>
+              <w:t xml:space="preserve">Add getDailyLog endpoint function</w:t>
+            </w:r>
+          </w:p>
+        </w:tc>
+      </w:tr>
+      <w:tr>
+        <w:tc>
+          <w:tcPr>
+            <w:tcW w:type="dxa" w:w="3000"/>
+            <w:tcBorders>
+              <w:top w:val="single" w:color="CCCCCC" w:sz="1"/>
+              <w:left w:val="single" w:color="CCCCCC" w:sz="1"/>
+              <w:bottom w:val="single" w:color="CCCCCC" w:sz="1"/>
+              <w:right w:val="single" w:color="CCCCCC" w:sz="1"/>
+            </w:tcBorders>
+            <w:tcMar>
+              <w:top w:type="dxa" w:w="80"/>
+              <w:left w:type="dxa" w:w="120"/>
+              <w:bottom w:type="dxa" w:w="80"/>
+              <w:right w:type="dxa" w:w="120"/>
+            </w:tcMar>
+          </w:tcPr>
+          <w:p>
+            <w:r>
+              <w:rPr>
+                <w:rFonts w:ascii="Arial" w:cs="Arial" w:eastAsia="Arial" w:hAnsi="Arial"/>
+                <w:sz w:val="20"/>
+                <w:szCs w:val="20"/>
+              </w:rPr>
+              <w:t xml:space="preserve">src/main.js</w:t>
+            </w:r>
+          </w:p>
+        </w:tc>
+        <w:tc>
+          <w:tcPr>
+            <w:tcW w:type="dxa" w:w="1800"/>
+            <w:tcBorders>
+              <w:top w:val="single" w:color="CCCCCC" w:sz="1"/>
+              <w:left w:val="single" w:color="CCCCCC" w:sz="1"/>
+              <w:bottom w:val="single" w:color="CCCCCC" w:sz="1"/>
+              <w:right w:val="single" w:color="CCCCCC" w:sz="1"/>
+            </w:tcBorders>
+            <w:tcMar>
+              <w:top w:type="dxa" w:w="80"/>
+              <w:left w:type="dxa" w:w="120"/>
+              <w:bottom w:type="dxa" w:w="80"/>
+              <w:right w:type="dxa" w:w="120"/>
+            </w:tcMar>
+          </w:tcPr>
+          <w:p>
+            <w:r>
+              <w:rPr>
+                <w:rFonts w:ascii="Arial" w:cs="Arial" w:eastAsia="Arial" w:hAnsi="Arial"/>
+                <w:sz w:val="20"/>
+                <w:szCs w:val="20"/>
+              </w:rPr>
+              <w:t xml:space="preserve">Frontend</w:t>
+            </w:r>
+          </w:p>
+        </w:tc>
+        <w:tc>
+          <w:tcPr>
+            <w:tcW w:type="dxa" w:w="4560"/>
+            <w:tcBorders>
+              <w:top w:val="single" w:color="CCCCCC" w:sz="1"/>
+              <w:left w:val="single" w:color="CCCCCC" w:sz="1"/>
+              <w:bottom w:val="single" w:color="CCCCCC" w:sz="1"/>
+              <w:right w:val="single" w:color="CCCCCC" w:sz="1"/>
+            </w:tcBorders>
+            <w:tcMar>
+              <w:top w:type="dxa" w:w="80"/>
+              <w:left w:type="dxa" w:w="120"/>
+              <w:bottom w:type="dxa" w:w="80"/>
+              <w:right w:type="dxa" w:w="120"/>
+            </w:tcMar>
+          </w:tcPr>
+          <w:p>
+            <w:r>
+              <w:rPr>
+                <w:rFonts w:ascii="Arial" w:cs="Arial" w:eastAsia="Arial" w:hAnsi="Arial"/>
+                <w:sz w:val="20"/>
+                <w:szCs w:val="20"/>
+              </w:rPr>
+              <w:t xml:space="preserve">Wire Today tab to initLog()</w:t>
+            </w:r>
+          </w:p>
+        </w:tc>
+      </w:tr>
+      <w:tr>
+        <w:tc>
+          <w:tcPr>
+            <w:tcW w:type="dxa" w:w="3000"/>
+            <w:tcBorders>
+              <w:top w:val="single" w:color="CCCCCC" w:sz="1"/>
+              <w:left w:val="single" w:color="CCCCCC" w:sz="1"/>
+              <w:bottom w:val="single" w:color="CCCCCC" w:sz="1"/>
+              <w:right w:val="single" w:color="CCCCCC" w:sz="1"/>
+            </w:tcBorders>
+            <w:tcMar>
+              <w:top w:type="dxa" w:w="80"/>
+              <w:left w:type="dxa" w:w="120"/>
+              <w:bottom w:type="dxa" w:w="80"/>
+              <w:right w:type="dxa" w:w="120"/>
+            </w:tcMar>
+          </w:tcPr>
+          <w:p>
+            <w:r>
+              <w:rPr>
+                <w:rFonts w:ascii="Arial" w:cs="Arial" w:eastAsia="Arial" w:hAnsi="Arial"/>
+                <w:sz w:val="20"/>
+                <w:szCs w:val="20"/>
+              </w:rPr>
+              <w:t xml:space="preserve">src/utils.js</w:t>
+            </w:r>
+          </w:p>
+        </w:tc>
+        <w:tc>
+          <w:tcPr>
+            <w:tcW w:type="dxa" w:w="1800"/>
+            <w:tcBorders>
+              <w:top w:val="single" w:color="CCCCCC" w:sz="1"/>
+              <w:left w:val="single" w:color="CCCCCC" w:sz="1"/>
+              <w:bottom w:val="single" w:color="CCCCCC" w:sz="1"/>
+              <w:right w:val="single" w:color="CCCCCC" w:sz="1"/>
+            </w:tcBorders>
+            <w:tcMar>
+              <w:top w:type="dxa" w:w="80"/>
+              <w:left w:type="dxa" w:w="120"/>
+              <w:bottom w:type="dxa" w:w="80"/>
+              <w:right w:type="dxa" w:w="120"/>
+            </w:tcMar>
+          </w:tcPr>
+          <w:p>
+            <w:r>
+              <w:rPr>
+                <w:rFonts w:ascii="Arial" w:cs="Arial" w:eastAsia="Arial" w:hAnsi="Arial"/>
+                <w:sz w:val="20"/>
+                <w:szCs w:val="20"/>
+              </w:rPr>
+              <w:t xml:space="preserve">Frontend</w:t>
+            </w:r>
+          </w:p>
+        </w:tc>
+        <w:tc>
+          <w:tcPr>
+            <w:tcW w:type="dxa" w:w="4560"/>
+            <w:tcBorders>
+              <w:top w:val="single" w:color="CCCCCC" w:sz="1"/>
+              <w:left w:val="single" w:color="CCCCCC" w:sz="1"/>
+              <w:bottom w:val="single" w:color="CCCCCC" w:sz="1"/>
+              <w:right w:val="single" w:color="CCCCCC" w:sz="1"/>
+            </w:tcBorders>
+            <w:tcMar>
+              <w:top w:type="dxa" w:w="80"/>
+              <w:left w:type="dxa" w:w="120"/>
+              <w:bottom w:type="dxa" w:w="80"/>
+              <w:right w:type="dxa" w:w="120"/>
+            </w:tcMar>
+          </w:tcPr>
+          <w:p>
+            <w:r>
+              <w:rPr>
+                <w:rFonts w:ascii="Arial" w:cs="Arial" w:eastAsia="Arial" w:hAnsi="Arial"/>
+                <w:sz w:val="20"/>
+                <w:szCs w:val="20"/>
+              </w:rPr>
+              <w:t xml:space="preserve">Fix date format: d/m/yy (was m/d/yy); parseDate handles space after comma</w:t>
+            </w:r>
+          </w:p>
+        </w:tc>
+      </w:tr>
+      <w:tr>
+        <w:tc>
+          <w:tcPr>
+            <w:tcW w:type="dxa" w:w="3000"/>
+            <w:tcBorders>
+              <w:top w:val="single" w:color="CCCCCC" w:sz="1"/>
+              <w:left w:val="single" w:color="CCCCCC" w:sz="1"/>
+              <w:bottom w:val="single" w:color="CCCCCC" w:sz="1"/>
+              <w:right w:val="single" w:color="CCCCCC" w:sz="1"/>
+            </w:tcBorders>
+            <w:tcMar>
+              <w:top w:type="dxa" w:w="80"/>
+              <w:left w:type="dxa" w:w="120"/>
+              <w:bottom w:type="dxa" w:w="80"/>
+              <w:right w:type="dxa" w:w="120"/>
+            </w:tcMar>
+          </w:tcPr>
+          <w:p>
+            <w:r>
+              <w:rPr>
+                <w:rFonts w:ascii="Arial" w:cs="Arial" w:eastAsia="Arial" w:hAnsi="Arial"/>
+                <w:sz w:val="20"/>
+                <w:szCs w:val="20"/>
+              </w:rPr>
+              <w:t xml:space="preserve">styles/main.css</w:t>
+            </w:r>
+          </w:p>
+        </w:tc>
+        <w:tc>
+          <w:tcPr>
+            <w:tcW w:type="dxa" w:w="1800"/>
+            <w:tcBorders>
+              <w:top w:val="single" w:color="CCCCCC" w:sz="1"/>
+              <w:left w:val="single" w:color="CCCCCC" w:sz="1"/>
+              <w:bottom w:val="single" w:color="CCCCCC" w:sz="1"/>
+              <w:right w:val="single" w:color="CCCCCC" w:sz="1"/>
+            </w:tcBorders>
+            <w:tcMar>
+              <w:top w:type="dxa" w:w="80"/>
+              <w:left w:type="dxa" w:w="120"/>
+              <w:bottom w:type="dxa" w:w="80"/>
+              <w:right w:type="dxa" w:w="120"/>
+            </w:tcMar>
+          </w:tcPr>
+          <w:p>
+            <w:r>
+              <w:rPr>
+                <w:rFonts w:ascii="Arial" w:cs="Arial" w:eastAsia="Arial" w:hAnsi="Arial"/>
+                <w:sz w:val="20"/>
+                <w:szCs w:val="20"/>
+              </w:rPr>
+              <w:t xml:space="preserve">Frontend</w:t>
+            </w:r>
+          </w:p>
+        </w:tc>
+        <w:tc>
+          <w:tcPr>
+            <w:tcW w:type="dxa" w:w="4560"/>
+            <w:tcBorders>
+              <w:top w:val="single" w:color="CCCCCC" w:sz="1"/>
+              <w:left w:val="single" w:color="CCCCCC" w:sz="1"/>
+              <w:bottom w:val="single" w:color="CCCCCC" w:sz="1"/>
+              <w:right w:val="single" w:color="CCCCCC" w:sz="1"/>
+            </w:tcBorders>
+            <w:tcMar>
+              <w:top w:type="dxa" w:w="80"/>
+              <w:left w:type="dxa" w:w="120"/>
+              <w:bottom w:type="dxa" w:w="80"/>
+              <w:right w:type="dxa" w:w="120"/>
+            </w:tcMar>
+          </w:tcPr>
+          <w:p>
+            <w:r>
+              <w:rPr>
+                <w:rFonts w:ascii="Arial" w:cs="Arial" w:eastAsia="Arial" w:hAnsi="Arial"/>
+                <w:sz w:val="20"/>
+                <w:szCs w:val="20"/>
+              </w:rPr>
+              <w:t xml:space="preserve">Append log page, summary strip, meal section, entry row styles</w:t>
             </w:r>
           </w:p>
         </w:tc>
@@ -665,7 +950,7 @@
           <w:sz w:val="20"/>
           <w:szCs w:val="20"/>
         </w:rPr>
-        <w:t xml:space="preserve">updateSettings (GAS): was iterating payload top-level keys, writing "settings" as a key; fixed to read payload.settings object</w:t>
+        <w:t xml:space="preserve">Date format was m/d/yy; corrected to d/m/yy to match Google Sheets data (e.g. Wed,4/3/26 = 4 March 2026)</w:t>
       </w:r>
     </w:p>
     <w:p>
@@ -683,7 +968,7 @@
           <w:sz w:val="20"/>
           <w:szCs w:val="20"/>
         </w:rPr>
-        <w:t xml:space="preserve">Settings sheet: removed dirty row 11 (settings | {calorie_target=2200.0}) left by the bug</w:t>
+        <w:t xml:space="preserve">DailyLog sheet has no MEAL_NO column; config.gs column indices corrected (NAME=3, AMOUNT=4, etc.)</w:t>
       </w:r>
     </w:p>
     <w:p>
@@ -701,7 +986,7 @@
           <w:sz w:val="20"/>
           <w:szCs w:val="20"/>
         </w:rPr>
-        <w:t xml:space="preserve">Fibre max raised from 100 to 200 to allow valid 3-digit inputs</w:t>
+        <w:t xml:space="preserve">getDailyLog date comparison now normalises spaces after comma for compatibility</w:t>
       </w:r>
     </w:p>
     <w:p>
@@ -719,7 +1004,7 @@
           <w:sz w:val="20"/>
           <w:szCs w:val="20"/>
         </w:rPr>
-        <w:t xml:space="preserve">Removed Sodium and Potassium from Settings UI (not needed for daily tracking)</w:t>
+        <w:t xml:space="preserve">Na/K minerals added to entry row display</w:t>
       </w:r>
     </w:p>
     <w:p>
@@ -754,7 +1039,7 @@
           <w:sz w:val="24"/>
           <w:szCs w:val="24"/>
         </w:rPr>
-        <w:t xml:space="preserve">B2 · Food Search  —  2026-03-23</w:t>
+        <w:t xml:space="preserve">B3 · Settings Editor  —  2026-03-23</w:t>
       </w:r>
     </w:p>
     <w:p>
@@ -787,7 +1072,7 @@
           <w:sz w:val="20"/>
           <w:szCs w:val="20"/>
         </w:rPr>
-        <w:t xml:space="preserve">Full NutritionDB + CustomFoods search with client-side cache</w:t>
+        <w:t xml:space="preserve">5-field settings editor (Calories/Protein/Carbs/Fat/Fibre), saves to Sheets</w:t>
       </w:r>
     </w:p>
     <w:p>
@@ -805,7 +1090,57 @@
           <w:sz w:val="20"/>
           <w:szCs w:val="20"/>
         </w:rPr>
-        <w:t xml:space="preserve">Favourites toggle, persisted to Sheets, sort-first in results</w:t>
+        <w:t xml:space="preserve">Bugs fixed: updateSettings payload.settings, fibre max 200, removed sodium from UI</w:t>
+      </w:r>
+    </w:p>
+    <w:p>
+      <w:pPr>
+        <w:spacing w:after="120"/>
+      </w:pPr>
+      <w:r>
+        <w:t xml:space="preserve"/>
+      </w:r>
+    </w:p>
+    <w:p>
+      <w:pPr>
+        <w:pBdr>
+          <w:bottom w:val="single" w:color="D8E4D0" w:sz="4" w:space="1"/>
+        </w:pBdr>
+        <w:spacing w:after="160"/>
+      </w:pPr>
+      <w:r>
+        <w:t xml:space="preserve"/>
+      </w:r>
+    </w:p>
+    <w:p>
+      <w:pPr>
+        <w:pStyle w:val="Heading2"/>
+      </w:pPr>
+      <w:r>
+        <w:rPr>
+          <w:rFonts w:ascii="Arial" w:cs="Arial" w:eastAsia="Arial" w:hAnsi="Arial"/>
+          <w:b/>
+          <w:bCs/>
+          <w:color w:val="697A58"/>
+          <w:sz w:val="24"/>
+          <w:szCs w:val="24"/>
+        </w:rPr>
+        <w:t xml:space="preserve">B2 · Food Search  —  2026-03-23</w:t>
+      </w:r>
+    </w:p>
+    <w:p>
+      <w:pPr>
+        <w:spacing w:after="100"/>
+      </w:pPr>
+      <w:r>
+        <w:rPr>
+          <w:rFonts w:ascii="Arial" w:cs="Arial" w:eastAsia="Arial" w:hAnsi="Arial"/>
+          <w:b/>
+          <w:bCs/>
+          <w:sz w:val="20"/>
+          <w:szCs w:val="20"/>
+        </w:rPr>
+        <w:t xml:space="preserve">Status: COMPLETE</w:t>
       </w:r>
     </w:p>
     <w:p>
@@ -823,7 +1158,57 @@
           <w:sz w:val="20"/>
           <w:szCs w:val="20"/>
         </w:rPr>
-        <w:t xml:space="preserve">Bottom sheet: amount input + meal type selector</w:t>
+        <w:t xml:space="preserve">NutritionDB+CustomFoods search, favourites, bottom sheet</w:t>
+      </w:r>
+    </w:p>
+    <w:p>
+      <w:pPr>
+        <w:spacing w:after="120"/>
+      </w:pPr>
+      <w:r>
+        <w:t xml:space="preserve"/>
+      </w:r>
+    </w:p>
+    <w:p>
+      <w:pPr>
+        <w:pBdr>
+          <w:bottom w:val="single" w:color="D8E4D0" w:sz="4" w:space="1"/>
+        </w:pBdr>
+        <w:spacing w:after="160"/>
+      </w:pPr>
+      <w:r>
+        <w:t xml:space="preserve"/>
+      </w:r>
+    </w:p>
+    <w:p>
+      <w:pPr>
+        <w:pStyle w:val="Heading2"/>
+      </w:pPr>
+      <w:r>
+        <w:rPr>
+          <w:rFonts w:ascii="Arial" w:cs="Arial" w:eastAsia="Arial" w:hAnsi="Arial"/>
+          <w:b/>
+          <w:bCs/>
+          <w:color w:val="697A58"/>
+          <w:sz w:val="24"/>
+          <w:szCs w:val="24"/>
+        </w:rPr>
+        <w:t xml:space="preserve">B1 · Auth + Skeleton  —  2026-03-22</w:t>
+      </w:r>
+    </w:p>
+    <w:p>
+      <w:pPr>
+        <w:spacing w:after="100"/>
+      </w:pPr>
+      <w:r>
+        <w:rPr>
+          <w:rFonts w:ascii="Arial" w:cs="Arial" w:eastAsia="Arial" w:hAnsi="Arial"/>
+          <w:b/>
+          <w:bCs/>
+          <w:sz w:val="20"/>
+          <w:szCs w:val="20"/>
+        </w:rPr>
+        <w:t xml:space="preserve">Status: COMPLETE</w:t>
       </w:r>
     </w:p>
     <w:p>
@@ -841,7 +1226,7 @@
           <w:sz w:val="20"/>
           <w:szCs w:val="20"/>
         </w:rPr>
-        <w:t xml:space="preserve">Bugs fixed: verifyPin payload, searchFoods URL param, toggleFavourite payload, clearToken()</w:t>
+        <w:t xml:space="preserve">PIN login, sessionStorage token, 5-tab navigation</w:t>
       </w:r>
     </w:p>
     <w:p>
@@ -876,7 +1261,7 @@
           <w:sz w:val="24"/>
           <w:szCs w:val="24"/>
         </w:rPr>
-        <w:t xml:space="preserve">B1 · Auth + Skeleton  —  2026-03-22</w:t>
+        <w:t xml:space="preserve">B0 · Infrastructure  —  2026-03-22</w:t>
       </w:r>
     </w:p>
     <w:p>
@@ -909,75 +1294,7 @@
           <w:sz w:val="20"/>
           <w:szCs w:val="20"/>
         </w:rPr>
-        <w:t xml:space="preserve">PIN login with SHA-256, sessionStorage token, 5-tab navigation</w:t>
-      </w:r>
-    </w:p>
-    <w:p>
-      <w:pPr>
-        <w:spacing w:after="120"/>
-      </w:pPr>
-      <w:r>
-        <w:t xml:space="preserve"/>
-      </w:r>
-    </w:p>
-    <w:p>
-      <w:pPr>
-        <w:pBdr>
-          <w:bottom w:val="single" w:color="D8E4D0" w:sz="4" w:space="1"/>
-        </w:pBdr>
-        <w:spacing w:after="160"/>
-      </w:pPr>
-      <w:r>
-        <w:t xml:space="preserve"/>
-      </w:r>
-    </w:p>
-    <w:p>
-      <w:pPr>
-        <w:pStyle w:val="Heading2"/>
-      </w:pPr>
-      <w:r>
-        <w:rPr>
-          <w:rFonts w:ascii="Arial" w:cs="Arial" w:eastAsia="Arial" w:hAnsi="Arial"/>
-          <w:b/>
-          <w:bCs/>
-          <w:color w:val="697A58"/>
-          <w:sz w:val="24"/>
-          <w:szCs w:val="24"/>
-        </w:rPr>
-        <w:t xml:space="preserve">B0 · Infrastructure  —  2026-03-22</w:t>
-      </w:r>
-    </w:p>
-    <w:p>
-      <w:pPr>
-        <w:spacing w:after="100"/>
-      </w:pPr>
-      <w:r>
-        <w:rPr>
-          <w:rFonts w:ascii="Arial" w:cs="Arial" w:eastAsia="Arial" w:hAnsi="Arial"/>
-          <w:b/>
-          <w:bCs/>
-          <w:sz w:val="20"/>
-          <w:szCs w:val="20"/>
-        </w:rPr>
-        <w:t xml:space="preserve">Status: COMPLETE</w:t>
-      </w:r>
-    </w:p>
-    <w:p>
-      <w:pPr>
-        <w:pStyle w:val="ListParagraph"/>
-        <w:numPr>
-          <w:ilvl w:val="0"/>
-          <w:numId w:val="2"/>
-        </w:numPr>
-        <w:spacing w:after="80"/>
-      </w:pPr>
-      <w:r>
-        <w:rPr>
-          <w:rFonts w:ascii="Arial" w:cs="Arial" w:eastAsia="Arial" w:hAnsi="Arial"/>
-          <w:sz w:val="20"/>
-          <w:szCs w:val="20"/>
-        </w:rPr>
-        <w:t xml:space="preserve">GitHub Pages, Apps Script, 8 Sheets tabs, default Settings data</w:t>
+        <w:t xml:space="preserve">GitHub Pages, Apps Script, 8 Sheets tabs</w:t>
       </w:r>
     </w:p>
     <w:sectPr>

</xml_diff>

<commit_message>
docs: B5 complete - update CLAUDE.md, Changelog, OperationsRunbook v1.5; archive v1.4
</commit_message>
<xml_diff>
--- a/docs/NutriLog_Changelog_v1.0.docx
+++ b/docs/NutriLog_Changelog_v1.0.docx
@@ -52,7 +52,7 @@
           <w:sz w:val="24"/>
           <w:szCs w:val="24"/>
         </w:rPr>
-        <w:t xml:space="preserve">B4 · Today Log Display  —  2026-03-23</w:t>
+        <w:t xml:space="preserve">B5 · Log Entry CRUD  —  2026-03-23  ⭐ 可日常使用</w:t>
       </w:r>
     </w:p>
     <w:p>
@@ -108,97 +108,169 @@
           <w:sz w:val="20"/>
           <w:szCs w:val="20"/>
         </w:rPr>
-        <w:t xml:space="preserve">Today tab: reads DailyLog sheet and displays entries grouped by meal type</w:t>
-      </w:r>
-    </w:p>
-    <w:p>
-      <w:pPr>
-        <w:pStyle w:val="ListParagraph"/>
-        <w:numPr>
-          <w:ilvl w:val="0"/>
-          <w:numId w:val="2"/>
-        </w:numPr>
-        <w:spacing w:after="80"/>
-      </w:pPr>
-      <w:r>
-        <w:rPr>
-          <w:rFonts w:ascii="Arial" w:cs="Arial" w:eastAsia="Arial" w:hAnsi="Arial"/>
-          <w:sz w:val="20"/>
-          <w:szCs w:val="20"/>
-        </w:rPr>
-        <w:t xml:space="preserve">Date navigation: left/right arrows to browse any date</w:t>
-      </w:r>
-    </w:p>
-    <w:p>
-      <w:pPr>
-        <w:pStyle w:val="ListParagraph"/>
-        <w:numPr>
-          <w:ilvl w:val="0"/>
-          <w:numId w:val="2"/>
-        </w:numPr>
-        <w:spacing w:after="80"/>
-      </w:pPr>
-      <w:r>
-        <w:rPr>
-          <w:rFonts w:ascii="Arial" w:cs="Arial" w:eastAsia="Arial" w:hAnsi="Arial"/>
-          <w:sz w:val="20"/>
-          <w:szCs w:val="20"/>
-        </w:rPr>
-        <w:t xml:space="preserve">Summary strip: 5 macro progress bars (Calories/Protein/Carbs/Fat/Fibre) with colour thresholds</w:t>
-      </w:r>
-    </w:p>
-    <w:p>
-      <w:pPr>
-        <w:pStyle w:val="ListParagraph"/>
-        <w:numPr>
-          <w:ilvl w:val="0"/>
-          <w:numId w:val="2"/>
-        </w:numPr>
-        <w:spacing w:after="80"/>
-      </w:pPr>
-      <w:r>
-        <w:rPr>
-          <w:rFonts w:ascii="Arial" w:cs="Arial" w:eastAsia="Arial" w:hAnsi="Arial"/>
-          <w:sz w:val="20"/>
-          <w:szCs w:val="20"/>
-        </w:rPr>
-        <w:t xml:space="preserve">Entry rows: food name, amount, kcal, P/C/F macros, Na/K minerals</w:t>
-      </w:r>
-    </w:p>
-    <w:p>
-      <w:pPr>
-        <w:pStyle w:val="ListParagraph"/>
-        <w:numPr>
-          <w:ilvl w:val="0"/>
-          <w:numId w:val="2"/>
-        </w:numPr>
-        <w:spacing w:after="80"/>
-      </w:pPr>
-      <w:r>
-        <w:rPr>
-          <w:rFonts w:ascii="Arial" w:cs="Arial" w:eastAsia="Arial" w:hAnsi="Arial"/>
-          <w:sz w:val="20"/>
-          <w:szCs w:val="20"/>
-        </w:rPr>
-        <w:t xml:space="preserve">Empty state displayed for dates with no entries</w:t>
-      </w:r>
-    </w:p>
-    <w:p>
-      <w:pPr>
-        <w:pStyle w:val="ListParagraph"/>
-        <w:numPr>
-          <w:ilvl w:val="0"/>
-          <w:numId w:val="2"/>
-        </w:numPr>
-        <w:spacing w:after="80"/>
-      </w:pPr>
-      <w:r>
-        <w:rPr>
-          <w:rFonts w:ascii="Arial" w:cs="Arial" w:eastAsia="Arial" w:hAnsi="Arial"/>
-          <w:sz w:val="20"/>
-          <w:szCs w:val="20"/>
-        </w:rPr>
-        <w:t xml:space="preserve">Client-side cache: daily log cached in store.state.dailyLog per date</w:t>
+        <w:t xml:space="preserve">Add food to log: Search → select food → set amount &amp; meal type → writes to DailyLog sheet</w:t>
+      </w:r>
+    </w:p>
+    <w:p>
+      <w:pPr>
+        <w:pStyle w:val="ListParagraph"/>
+        <w:numPr>
+          <w:ilvl w:val="0"/>
+          <w:numId w:val="2"/>
+        </w:numPr>
+        <w:spacing w:after="80"/>
+      </w:pPr>
+      <w:r>
+        <w:rPr>
+          <w:rFonts w:ascii="Arial" w:cs="Arial" w:eastAsia="Arial" w:hAnsi="Arial"/>
+          <w:sz w:val="20"/>
+          <w:szCs w:val="20"/>
+        </w:rPr>
+        <w:t xml:space="preserve">Inline amount edit: tap amount badge → input appears → Enter to confirm → nutrients scaled proportionally</w:t>
+      </w:r>
+    </w:p>
+    <w:p>
+      <w:pPr>
+        <w:pStyle w:val="ListParagraph"/>
+        <w:numPr>
+          <w:ilvl w:val="0"/>
+          <w:numId w:val="2"/>
+        </w:numPr>
+        <w:spacing w:after="80"/>
+      </w:pPr>
+      <w:r>
+        <w:rPr>
+          <w:rFonts w:ascii="Arial" w:cs="Arial" w:eastAsia="Arial" w:hAnsi="Arial"/>
+          <w:sz w:val="20"/>
+          <w:szCs w:val="20"/>
+        </w:rPr>
+        <w:t xml:space="preserve">Delete entry (iPhone): swipe left → Delete button slides out (absolute position, no blank space)</w:t>
+      </w:r>
+    </w:p>
+    <w:p>
+      <w:pPr>
+        <w:pStyle w:val="ListParagraph"/>
+        <w:numPr>
+          <w:ilvl w:val="0"/>
+          <w:numId w:val="2"/>
+        </w:numPr>
+        <w:spacing w:after="80"/>
+      </w:pPr>
+      <w:r>
+        <w:rPr>
+          <w:rFonts w:ascii="Arial" w:cs="Arial" w:eastAsia="Arial" w:hAnsi="Arial"/>
+          <w:sz w:val="20"/>
+          <w:szCs w:val="20"/>
+        </w:rPr>
+        <w:t xml:space="preserve">Delete entry (Mac): hover → Delete button appears on right</w:t>
+      </w:r>
+    </w:p>
+    <w:p>
+      <w:pPr>
+        <w:pStyle w:val="ListParagraph"/>
+        <w:numPr>
+          <w:ilvl w:val="0"/>
+          <w:numId w:val="2"/>
+        </w:numPr>
+        <w:spacing w:after="80"/>
+      </w:pPr>
+      <w:r>
+        <w:rPr>
+          <w:rFonts w:ascii="Arial" w:cs="Arial" w:eastAsia="Arial" w:hAnsi="Arial"/>
+          <w:sz w:val="20"/>
+          <w:szCs w:val="20"/>
+        </w:rPr>
+        <w:t xml:space="preserve">Delete cleans up: if last entry in meal section, entire section fades out</w:t>
+      </w:r>
+    </w:p>
+    <w:p>
+      <w:pPr>
+        <w:pStyle w:val="ListParagraph"/>
+        <w:numPr>
+          <w:ilvl w:val="0"/>
+          <w:numId w:val="2"/>
+        </w:numPr>
+        <w:spacing w:after="80"/>
+      </w:pPr>
+      <w:r>
+        <w:rPr>
+          <w:rFonts w:ascii="Arial" w:cs="Arial" w:eastAsia="Arial" w:hAnsi="Arial"/>
+          <w:sz w:val="20"/>
+          <w:szCs w:val="20"/>
+        </w:rPr>
+        <w:t xml:space="preserve">Sync to DailySummary: writes both target values (from Settings) and actual totals to correct columns</w:t>
+      </w:r>
+    </w:p>
+    <w:p>
+      <w:pPr>
+        <w:pStyle w:val="ListParagraph"/>
+        <w:numPr>
+          <w:ilvl w:val="0"/>
+          <w:numId w:val="2"/>
+        </w:numPr>
+        <w:spacing w:after="80"/>
+      </w:pPr>
+      <w:r>
+        <w:rPr>
+          <w:rFonts w:ascii="Arial" w:cs="Arial" w:eastAsia="Arial" w:hAnsi="Arial"/>
+          <w:sz w:val="20"/>
+          <w:szCs w:val="20"/>
+        </w:rPr>
+        <w:t xml:space="preserve">Mac dual-column layout: left = log entries, right = nutrition summary panel + Sync button</w:t>
+      </w:r>
+    </w:p>
+    <w:p>
+      <w:pPr>
+        <w:pStyle w:val="ListParagraph"/>
+        <w:numPr>
+          <w:ilvl w:val="0"/>
+          <w:numId w:val="2"/>
+        </w:numPr>
+        <w:spacing w:after="80"/>
+      </w:pPr>
+      <w:r>
+        <w:rPr>
+          <w:rFonts w:ascii="Arial" w:cs="Arial" w:eastAsia="Arial" w:hAnsi="Arial"/>
+          <w:sz w:val="20"/>
+          <w:szCs w:val="20"/>
+        </w:rPr>
+        <w:t xml:space="preserve">Logout button added to Tab bar</w:t>
+      </w:r>
+    </w:p>
+    <w:p>
+      <w:pPr>
+        <w:pStyle w:val="ListParagraph"/>
+        <w:numPr>
+          <w:ilvl w:val="0"/>
+          <w:numId w:val="2"/>
+        </w:numPr>
+        <w:spacing w:after="80"/>
+      </w:pPr>
+      <w:r>
+        <w:rPr>
+          <w:rFonts w:ascii="Arial" w:cs="Arial" w:eastAsia="Arial" w:hAnsi="Arial"/>
+          <w:sz w:val="20"/>
+          <w:szCs w:val="20"/>
+        </w:rPr>
+        <w:t xml:space="preserve">Instant search: debounce removed, local filtering is immediate</w:t>
+      </w:r>
+    </w:p>
+    <w:p>
+      <w:pPr>
+        <w:pStyle w:val="ListParagraph"/>
+        <w:numPr>
+          <w:ilvl w:val="0"/>
+          <w:numId w:val="2"/>
+        </w:numPr>
+        <w:spacing w:after="80"/>
+      </w:pPr>
+      <w:r>
+        <w:rPr>
+          <w:rFonts w:ascii="Arial" w:cs="Arial" w:eastAsia="Arial" w:hAnsi="Arial"/>
+          <w:sz w:val="20"/>
+          <w:szCs w:val="20"/>
+        </w:rPr>
+        <w:t xml:space="preserve">Tab dedup: switching to same tab does not re-initialize</w:t>
       </w:r>
     </w:p>
     <w:p>
@@ -408,7 +480,7 @@
                 <w:sz w:val="20"/>
                 <w:szCs w:val="20"/>
               </w:rPr>
-              <w:t xml:space="preserve">Add getDailyLog endpoint</w:t>
+              <w:t xml:space="preserve">Add addLogEntry, deleteLogEntry, updateLogEntry, syncDailySummary</w:t>
             </w:r>
           </w:p>
         </w:tc>
@@ -491,7 +563,7 @@
                 <w:sz w:val="20"/>
                 <w:szCs w:val="20"/>
               </w:rPr>
-              <w:t xml:space="preserve">Add dailyLog column indices (no MEAL_NO, NAME at index 3)</w:t>
+              <w:t xml:space="preserve">Add dailySummary column indices (target+actual pairs); dailyLog createdDatetime col</w:t>
             </w:r>
           </w:p>
         </w:tc>
@@ -520,7 +592,7 @@
                 <w:sz w:val="20"/>
                 <w:szCs w:val="20"/>
               </w:rPr>
-              <w:t xml:space="preserve">src/log.js</w:t>
+              <w:t xml:space="preserve">src/api.js</w:t>
             </w:r>
           </w:p>
         </w:tc>
@@ -574,7 +646,7 @@
                 <w:sz w:val="20"/>
                 <w:szCs w:val="20"/>
               </w:rPr>
-              <w:t xml:space="preserve">New: Today log page, date nav, summary strip, meal sections, entry rows</w:t>
+              <w:t xml:space="preserve">Add B5 endpoint functions</w:t>
             </w:r>
           </w:p>
         </w:tc>
@@ -603,7 +675,7 @@
                 <w:sz w:val="20"/>
                 <w:szCs w:val="20"/>
               </w:rPr>
-              <w:t xml:space="preserve">src/api.js</w:t>
+              <w:t xml:space="preserve">src/log.js</w:t>
             </w:r>
           </w:p>
         </w:tc>
@@ -657,7 +729,7 @@
                 <w:sz w:val="20"/>
                 <w:szCs w:val="20"/>
               </w:rPr>
-              <w:t xml:space="preserve">Add getDailyLog endpoint function</w:t>
+              <w:t xml:space="preserve">Full CRUD: add/delete/update; Mac sidebar; smooth delete animation</w:t>
             </w:r>
           </w:p>
         </w:tc>
@@ -686,7 +758,7 @@
                 <w:sz w:val="20"/>
                 <w:szCs w:val="20"/>
               </w:rPr>
-              <w:t xml:space="preserve">src/main.js</w:t>
+              <w:t xml:space="preserve">src/search.js</w:t>
             </w:r>
           </w:p>
         </w:tc>
@@ -740,7 +812,7 @@
                 <w:sz w:val="20"/>
                 <w:szCs w:val="20"/>
               </w:rPr>
-              <w:t xml:space="preserve">Wire Today tab to initLog()</w:t>
+              <w:t xml:space="preserve">confirmAddFood writes to DailyLog; instant search (no debounce)</w:t>
             </w:r>
           </w:p>
         </w:tc>
@@ -769,7 +841,7 @@
                 <w:sz w:val="20"/>
                 <w:szCs w:val="20"/>
               </w:rPr>
-              <w:t xml:space="preserve">src/utils.js</w:t>
+              <w:t xml:space="preserve">src/main.js</w:t>
             </w:r>
           </w:p>
         </w:tc>
@@ -823,7 +895,7 @@
                 <w:sz w:val="20"/>
                 <w:szCs w:val="20"/>
               </w:rPr>
-              <w:t xml:space="preserve">Fix date format: d/m/yy (was m/d/yy); parseDate handles space after comma</w:t>
+              <w:t xml:space="preserve">Tab dedup; Logout button</w:t>
             </w:r>
           </w:p>
         </w:tc>
@@ -906,7 +978,7 @@
                 <w:sz w:val="20"/>
                 <w:szCs w:val="20"/>
               </w:rPr>
-              <w:t xml:space="preserve">Append log page, summary strip, meal section, entry row styles</w:t>
+              <w:t xml:space="preserve">Mac dual-column grid; swipe delete absolute position; sidebar mobile hide</w:t>
             </w:r>
           </w:p>
         </w:tc>
@@ -950,61 +1022,97 @@
           <w:sz w:val="20"/>
           <w:szCs w:val="20"/>
         </w:rPr>
-        <w:t xml:space="preserve">Date format was m/d/yy; corrected to d/m/yy to match Google Sheets data (e.g. Wed,4/3/26 = 4 March 2026)</w:t>
-      </w:r>
-    </w:p>
-    <w:p>
-      <w:pPr>
-        <w:pStyle w:val="ListParagraph"/>
-        <w:numPr>
-          <w:ilvl w:val="0"/>
-          <w:numId w:val="2"/>
-        </w:numPr>
-        <w:spacing w:after="80"/>
-      </w:pPr>
-      <w:r>
-        <w:rPr>
-          <w:rFonts w:ascii="Arial" w:cs="Arial" w:eastAsia="Arial" w:hAnsi="Arial"/>
-          <w:sz w:val="20"/>
-          <w:szCs w:val="20"/>
-        </w:rPr>
-        <w:t xml:space="preserve">DailyLog sheet has no MEAL_NO column; config.gs column indices corrected (NAME=3, AMOUNT=4, etc.)</w:t>
-      </w:r>
-    </w:p>
-    <w:p>
-      <w:pPr>
-        <w:pStyle w:val="ListParagraph"/>
-        <w:numPr>
-          <w:ilvl w:val="0"/>
-          <w:numId w:val="2"/>
-        </w:numPr>
-        <w:spacing w:after="80"/>
-      </w:pPr>
-      <w:r>
-        <w:rPr>
-          <w:rFonts w:ascii="Arial" w:cs="Arial" w:eastAsia="Arial" w:hAnsi="Arial"/>
-          <w:sz w:val="20"/>
-          <w:szCs w:val="20"/>
-        </w:rPr>
-        <w:t xml:space="preserve">getDailyLog date comparison now normalises spaces after comma for compatibility</w:t>
-      </w:r>
-    </w:p>
-    <w:p>
-      <w:pPr>
-        <w:pStyle w:val="ListParagraph"/>
-        <w:numPr>
-          <w:ilvl w:val="0"/>
-          <w:numId w:val="2"/>
-        </w:numPr>
-        <w:spacing w:after="80"/>
-      </w:pPr>
-      <w:r>
-        <w:rPr>
-          <w:rFonts w:ascii="Arial" w:cs="Arial" w:eastAsia="Arial" w:hAnsi="Arial"/>
-          <w:sz w:val="20"/>
-          <w:szCs w:val="20"/>
-        </w:rPr>
-        <w:t xml:space="preserve">Na/K minerals added to entry row display</w:t>
+        <w:t xml:space="preserve">searchFoods: full load had maxResults:50 limit — removed limit for empty query (full DB load)</w:t>
+      </w:r>
+    </w:p>
+    <w:p>
+      <w:pPr>
+        <w:pStyle w:val="ListParagraph"/>
+        <w:numPr>
+          <w:ilvl w:val="0"/>
+          <w:numId w:val="2"/>
+        </w:numPr>
+        <w:spacing w:after="80"/>
+      </w:pPr>
+      <w:r>
+        <w:rPr>
+          <w:rFonts w:ascii="Arial" w:cs="Arial" w:eastAsia="Arial" w:hAnsi="Arial"/>
+          <w:sz w:val="20"/>
+          <w:szCs w:val="20"/>
+        </w:rPr>
+        <w:t xml:space="preserve">DailySummary columns: was writing to wrong columns; fixed indices to match actual sheet structure</w:t>
+      </w:r>
+    </w:p>
+    <w:p>
+      <w:pPr>
+        <w:pStyle w:val="ListParagraph"/>
+        <w:numPr>
+          <w:ilvl w:val="0"/>
+          <w:numId w:val="2"/>
+        </w:numPr>
+        <w:spacing w:after="80"/>
+      </w:pPr>
+      <w:r>
+        <w:rPr>
+          <w:rFonts w:ascii="Arial" w:cs="Arial" w:eastAsia="Arial" w:hAnsi="Arial"/>
+          <w:sz w:val="20"/>
+          <w:szCs w:val="20"/>
+        </w:rPr>
+        <w:t xml:space="preserve">syncDailySummary: now also writes target values from Settings to B/D/F/H/J columns</w:t>
+      </w:r>
+    </w:p>
+    <w:p>
+      <w:pPr>
+        <w:pStyle w:val="ListParagraph"/>
+        <w:numPr>
+          <w:ilvl w:val="0"/>
+          <w:numId w:val="2"/>
+        </w:numPr>
+        <w:spacing w:after="80"/>
+      </w:pPr>
+      <w:r>
+        <w:rPr>
+          <w:rFonts w:ascii="Arial" w:cs="Arial" w:eastAsia="Arial" w:hAnsi="Arial"/>
+          <w:sz w:val="20"/>
+          <w:szCs w:val="20"/>
+        </w:rPr>
+        <w:t xml:space="preserve">Swipe delete: blank space caused by width animation; fixed with absolute positioning</w:t>
+      </w:r>
+    </w:p>
+    <w:p>
+      <w:pPr>
+        <w:pStyle w:val="ListParagraph"/>
+        <w:numPr>
+          <w:ilvl w:val="0"/>
+          <w:numId w:val="2"/>
+        </w:numPr>
+        <w:spacing w:after="80"/>
+      </w:pPr>
+      <w:r>
+        <w:rPr>
+          <w:rFonts w:ascii="Arial" w:cs="Arial" w:eastAsia="Arial" w:hAnsi="Arial"/>
+          <w:sz w:val="20"/>
+          <w:szCs w:val="20"/>
+        </w:rPr>
+        <w:t xml:space="preserve">Mobile layout: log-sidebar was showing on iPhone; fixed with display:none default</w:t>
+      </w:r>
+    </w:p>
+    <w:p>
+      <w:pPr>
+        <w:pStyle w:val="ListParagraph"/>
+        <w:numPr>
+          <w:ilvl w:val="0"/>
+          <w:numId w:val="2"/>
+        </w:numPr>
+        <w:spacing w:after="80"/>
+      </w:pPr>
+      <w:r>
+        <w:rPr>
+          <w:rFonts w:ascii="Arial" w:cs="Arial" w:eastAsia="Arial" w:hAnsi="Arial"/>
+          <w:sz w:val="20"/>
+          <w:szCs w:val="20"/>
+        </w:rPr>
+        <w:t xml:space="preserve">Delete reload: was reloading entire page; now removes DOM element directly</w:t>
       </w:r>
     </w:p>
     <w:p>
@@ -1039,7 +1147,7 @@
           <w:sz w:val="24"/>
           <w:szCs w:val="24"/>
         </w:rPr>
-        <w:t xml:space="preserve">B3 · Settings Editor  —  2026-03-23</w:t>
+        <w:t xml:space="preserve">B4 · Today Log Display  —  2026-03-23</w:t>
       </w:r>
     </w:p>
     <w:p>
@@ -1072,25 +1180,93 @@
           <w:sz w:val="20"/>
           <w:szCs w:val="20"/>
         </w:rPr>
-        <w:t xml:space="preserve">5-field settings editor (Calories/Protein/Carbs/Fat/Fibre), saves to Sheets</w:t>
-      </w:r>
-    </w:p>
-    <w:p>
-      <w:pPr>
-        <w:pStyle w:val="ListParagraph"/>
-        <w:numPr>
-          <w:ilvl w:val="0"/>
-          <w:numId w:val="2"/>
-        </w:numPr>
-        <w:spacing w:after="80"/>
-      </w:pPr>
-      <w:r>
-        <w:rPr>
-          <w:rFonts w:ascii="Arial" w:cs="Arial" w:eastAsia="Arial" w:hAnsi="Arial"/>
-          <w:sz w:val="20"/>
-          <w:szCs w:val="20"/>
-        </w:rPr>
-        <w:t xml:space="preserve">Bugs fixed: updateSettings payload.settings, fibre max 200, removed sodium from UI</w:t>
+        <w:t xml:space="preserve">getDailyLog, date navigation, macro progress bars, Na/K in entry rows</w:t>
+      </w:r>
+    </w:p>
+    <w:p>
+      <w:pPr>
+        <w:pStyle w:val="ListParagraph"/>
+        <w:numPr>
+          <w:ilvl w:val="0"/>
+          <w:numId w:val="2"/>
+        </w:numPr>
+        <w:spacing w:after="80"/>
+      </w:pPr>
+      <w:r>
+        <w:rPr>
+          <w:rFonts w:ascii="Arial" w:cs="Arial" w:eastAsia="Arial" w:hAnsi="Arial"/>
+          <w:sz w:val="20"/>
+          <w:szCs w:val="20"/>
+        </w:rPr>
+        <w:t xml:space="preserve">Date format confirmed: ddd,d/m/yy. DailyLog no MEAL_NO column.</w:t>
+      </w:r>
+    </w:p>
+    <w:p>
+      <w:pPr>
+        <w:spacing w:after="120"/>
+      </w:pPr>
+      <w:r>
+        <w:t xml:space="preserve"/>
+      </w:r>
+    </w:p>
+    <w:p>
+      <w:pPr>
+        <w:pBdr>
+          <w:bottom w:val="single" w:color="D8E4D0" w:sz="4" w:space="1"/>
+        </w:pBdr>
+        <w:spacing w:after="160"/>
+      </w:pPr>
+      <w:r>
+        <w:t xml:space="preserve"/>
+      </w:r>
+    </w:p>
+    <w:p>
+      <w:pPr>
+        <w:pStyle w:val="Heading2"/>
+      </w:pPr>
+      <w:r>
+        <w:rPr>
+          <w:rFonts w:ascii="Arial" w:cs="Arial" w:eastAsia="Arial" w:hAnsi="Arial"/>
+          <w:b/>
+          <w:bCs/>
+          <w:color w:val="697A58"/>
+          <w:sz w:val="24"/>
+          <w:szCs w:val="24"/>
+        </w:rPr>
+        <w:t xml:space="preserve">B3 · Settings Editor  —  2026-03-23</w:t>
+      </w:r>
+    </w:p>
+    <w:p>
+      <w:pPr>
+        <w:spacing w:after="100"/>
+      </w:pPr>
+      <w:r>
+        <w:rPr>
+          <w:rFonts w:ascii="Arial" w:cs="Arial" w:eastAsia="Arial" w:hAnsi="Arial"/>
+          <w:b/>
+          <w:bCs/>
+          <w:sz w:val="20"/>
+          <w:szCs w:val="20"/>
+        </w:rPr>
+        <w:t xml:space="preserve">Status: COMPLETE</w:t>
+      </w:r>
+    </w:p>
+    <w:p>
+      <w:pPr>
+        <w:pStyle w:val="ListParagraph"/>
+        <w:numPr>
+          <w:ilvl w:val="0"/>
+          <w:numId w:val="2"/>
+        </w:numPr>
+        <w:spacing w:after="80"/>
+      </w:pPr>
+      <w:r>
+        <w:rPr>
+          <w:rFonts w:ascii="Arial" w:cs="Arial" w:eastAsia="Arial" w:hAnsi="Arial"/>
+          <w:sz w:val="20"/>
+          <w:szCs w:val="20"/>
+        </w:rPr>
+        <w:t xml:space="preserve">5-field settings editor, saves to Sheets</w:t>
       </w:r>
     </w:p>
     <w:p>

</xml_diff>